<commit_message>
feat: add ADB and network runtime inventories
</commit_message>
<xml_diff>
--- a/docs/atlas-teorico-codex.docx
+++ b/docs/atlas-teorico-codex.docx
@@ -830,6 +830,48 @@
           <w:sz w:val="26"/>
         </w:rPr>
         <w:t>Herramientas, plugins, MCPs y comandos atlas-*</w:t>
+      </w:r>
+    </w:p>
+    <w:p>
+      <w:pPr>
+        <w:numPr>
+          <w:ilvl w:val="1"/>
+          <w:numId w:val="1"/>
+        </w:numPr>
+        <w:ind w:left="1440" w:hanging="360"/>
+        <w:rPr>
+          <w:sz w:val="26"/>
+          <w:szCs w:val="26"/>
+          <w:u w:val="none"/>
+        </w:rPr>
+      </w:pPr>
+      <w:r>
+        <w:rPr>
+          <w:rFonts w:ascii="Arial" w:hAnsi="Arial" w:cs="Arial"/>
+          <w:sz w:val="26"/>
+        </w:rPr>
+        <w:t>Control de dispositivos Android mediante ADB</w:t>
+      </w:r>
+    </w:p>
+    <w:p>
+      <w:pPr>
+        <w:numPr>
+          <w:ilvl w:val="1"/>
+          <w:numId w:val="1"/>
+        </w:numPr>
+        <w:ind w:left="1440" w:hanging="360"/>
+        <w:rPr>
+          <w:sz w:val="26"/>
+          <w:szCs w:val="26"/>
+          <w:u w:val="none"/>
+        </w:rPr>
+      </w:pPr>
+      <w:r>
+        <w:rPr>
+          <w:rFonts w:ascii="Arial" w:hAnsi="Arial" w:cs="Arial"/>
+          <w:sz w:val="26"/>
+        </w:rPr>
+        <w:t>Inventario automático de red con Nmap</w:t>
       </w:r>
     </w:p>
     <w:p>
@@ -4631,6 +4673,122 @@
     <w:p>
       <w:pPr>
         <w:keepNext/>
+        <w:pageBreakBefore w:val="0"/>
+        <w:spacing w:before="320" w:after="240"/>
+      </w:pPr>
+      <w:r>
+        <w:rPr>
+          <w:rFonts w:ascii="Arial" w:hAnsi="Arial"/>
+          <w:b/>
+          <w:i/>
+          <w:sz w:val="44"/>
+        </w:rPr>
+        <w:t>3.5 Control de dispositivos Android mediante ADB</w:t>
+      </w:r>
+    </w:p>
+    <w:p>
+      <w:pPr>
+        <w:spacing w:before="240" w:after="240" w:line="276" w:lineRule="auto"/>
+      </w:pPr>
+      <w:r>
+        <w:rPr>
+          <w:rFonts w:ascii="Arial" w:hAnsi="Arial"/>
+          <w:b w:val="0"/>
+          <w:i w:val="0"/>
+          <w:sz w:val="30"/>
+        </w:rPr>
+        <w:t>ADB, Android Debug Bridge, permite comunicarse con dispositivos Android por USB o por red. En ATLAS lo integré como una capacidad documentada del agente y no como una colección de órdenes sueltas. Cuando se establece una conexión, un proceso automático identifica el dispositivo y recoge información de solo lectura: fabricante, modelo, versión de Android, nivel de API, arquitectura, resolución, almacenamiento, batería, interfaces de red y otros datos útiles para diagnosticarlo.</w:t>
+      </w:r>
+    </w:p>
+    <w:p>
+      <w:pPr>
+        <w:spacing w:before="240" w:after="240" w:line="276" w:lineRule="auto"/>
+      </w:pPr>
+      <w:r>
+        <w:rPr>
+          <w:rFonts w:ascii="Arial" w:hAnsi="Arial"/>
+          <w:b w:val="0"/>
+          <w:i w:val="0"/>
+          <w:sz w:val="30"/>
+        </w:rPr>
+        <w:t>El inventario se guarda de forma privada en .atlas/atlas-adb/devices. El nombre del archivo utiliza la dirección MAC, el nombre del equipo y su tipo, por ejemplo MAC_nombre_phone.md. La MAC actúa como identificador estable: si el nombre o la versión cambia, se reemplaza el registro anterior en vez de crear duplicados. Si Android no permite leer una MAC fiable, se usa como alternativa el serial de ADB sin inventar datos.</w:t>
+      </w:r>
+    </w:p>
+    <w:p>
+      <w:pPr>
+        <w:spacing w:before="240" w:after="240" w:line="276" w:lineRule="auto"/>
+      </w:pPr>
+      <w:r>
+        <w:rPr>
+          <w:rFonts w:ascii="Arial" w:hAnsi="Arial"/>
+          <w:b w:val="0"/>
+          <w:i w:val="0"/>
+          <w:sz w:val="30"/>
+        </w:rPr>
+        <w:t>La recopilación se ejecuta en segundo plano al usar adb connect y también mediante un monitor ligero para detectar equipos conectados por USB. No instala aplicaciones, no cambia ajustes y no toca los archivos del dispositivo. Su función es ahorrar la exploración repetitiva: ATLAS puede leer primero la ficha ya generada y recurrir a nuevos comandos únicamente cuando la tarea lo exige.</w:t>
+      </w:r>
+    </w:p>
+    <w:p>
+      <w:pPr>
+        <w:keepNext/>
+        <w:pageBreakBefore w:val="0"/>
+        <w:spacing w:before="320" w:after="240"/>
+      </w:pPr>
+      <w:r>
+        <w:rPr>
+          <w:rFonts w:ascii="Arial" w:hAnsi="Arial"/>
+          <w:b/>
+          <w:i/>
+          <w:sz w:val="44"/>
+        </w:rPr>
+        <w:t>3.6 Inventario automático de red con Nmap</w:t>
+      </w:r>
+    </w:p>
+    <w:p>
+      <w:pPr>
+        <w:spacing w:before="240" w:after="240" w:line="276" w:lineRule="auto"/>
+      </w:pPr>
+      <w:r>
+        <w:rPr>
+          <w:rFonts w:ascii="Arial" w:hAnsi="Arial"/>
+          <w:b w:val="0"/>
+          <w:i w:val="0"/>
+          <w:sz w:val="30"/>
+        </w:rPr>
+        <w:t>Nmap complementa ADB porque permite saber qué dispositivos están activos en la red local y qué servicios exponen. ATLAS mantiene un informe en .atlas/atlas-nmap/REPORT.md que se actualiza cada diez minutos. Así, ante una pregunta como cuál es la IP de un ordenador, el agente puede consultar una fotografía reciente de la red antes de iniciar un escaneo nuevo.</w:t>
+      </w:r>
+    </w:p>
+    <w:p>
+      <w:pPr>
+        <w:spacing w:before="240" w:after="240" w:line="276" w:lineRule="auto"/>
+      </w:pPr>
+      <w:r>
+        <w:rPr>
+          <w:rFonts w:ascii="Arial" w:hAnsi="Arial"/>
+          <w:b w:val="0"/>
+          <w:i w:val="0"/>
+          <w:sz w:val="30"/>
+        </w:rPr>
+        <w:t>El escaneo periódico está limitado de forma deliberada: descubre hosts y revisa los cien puertos más habituales con detección ligera de versiones. Un barrido de los sesenta y cinco mil quinientos treinta y cinco puertos de cada equipo cada diez minutos sería técnicamente posible, pero añadiría tráfico, temperatura y ruido de diagnóstico sin una mejora proporcional. Para investigar un host concreto existe un análisis profundo bajo demanda.</w:t>
+      </w:r>
+    </w:p>
+    <w:p>
+      <w:pPr>
+        <w:spacing w:before="240" w:after="240" w:line="276" w:lineRule="auto"/>
+      </w:pPr>
+      <w:r>
+        <w:rPr>
+          <w:rFonts w:ascii="Arial" w:hAnsi="Arial"/>
+          <w:b w:val="0"/>
+          <w:i w:val="0"/>
+          <w:sz w:val="30"/>
+        </w:rPr>
+        <w:t>El informe se regenera de forma atómica: primero se construye una copia temporal y solo al terminar reemplaza la anterior. Si un escaneo falla, ATLAS no se queda con un archivo escrito a medias. Como los inventarios pueden revelar nombres, direcciones y servicios de la red doméstica, permanecen fuera del repositorio público; GitHub contiene el sistema y su documentación, no los datos privados recogidos.</w:t>
+      </w:r>
+    </w:p>
+    <w:p>
+      <w:pPr>
+        <w:keepNext/>
         <w:pageBreakBefore/>
         <w:spacing w:before="360" w:after="240"/>
       </w:pPr>
@@ -4785,7 +4943,7 @@
           <w:i w:val="0"/>
           <w:sz w:val="30"/>
         </w:rPr>
-        <w:t>La carpeta .openclaw contiene la configuración del Gateway, credenciales, sesiones, plugins y el workspace. La carpeta .atlas reúne las piezas específicas del dispositivo: atlas-webscreen, atlas-webscreen-workspace, atlas-desktop, atlas-screen, atlas-rafas y los backups relacionados. Los proyectos creados desde WebScreen se almacenan en un workspace separado para no llenar de pruebas la carpeta principal del agente.</w:t>
+        <w:t>La carpeta .openclaw contiene la configuración del Gateway, credenciales, sesiones, plugins y el workspace. La carpeta .atlas reúne las piezas específicas del dispositivo: atlas-webscreen, atlas-webscreen-workspace, atlas-desktop, atlas-screen, atlas-rafas, atlas-adb, atlas-nmap y los backups relacionados. Los proyectos creados desde WebScreen se almacenan en un workspace separado para no llenar de pruebas la carpeta principal del agente.</w:t>
       </w:r>
     </w:p>
     <w:p>
@@ -4929,7 +5087,7 @@
           <w:i w:val="0"/>
           <w:sz w:val="30"/>
         </w:rPr>
-        <w:t>Al apagar el sistema se muestra otra pantalla de despedida durante al menos un segundo y medio, pero únicamente si la pantalla ya estaba encendida. Si estaba apagada, el sistema no la enciende solo para despedirse; sería bonito durante dos segundos y absurdo para el consumo del resto del tiempo.</w:t>
+        <w:t>Al apagar o reiniciar el sistema se muestra otra pantalla de despedida durante al menos un segundo y medio, pero únicamente si la pantalla ya estaba encendida. Si estaba apagada, el sistema no la enciende solo para despedirse; sería bonito durante dos segundos y absurdo para el consumo del resto del tiempo.</w:t>
       </w:r>
     </w:p>
     <w:p>

</xml_diff>

<commit_message>
Add deterministic ATLAS routine engine
</commit_message>
<xml_diff>
--- a/docs/atlas-teorico-codex.docx
+++ b/docs/atlas-teorico-codex.docx
@@ -1271,6 +1271,33 @@
           <w:rtl w:val="0"/>
         </w:rPr>
         <w:t xml:space="preserve">Herramientas actuales y arquitectura futura</w:t>
+      </w:r>
+      <w:r>
+        <w:rPr>
+          <w:rtl w:val="0"/>
+        </w:rPr>
+      </w:r>
+    </w:p>
+    <w:p>
+      <w:pPr>
+        <w:numPr>
+          <w:ilvl w:val="1"/>
+          <w:numId w:val="1"/>
+        </w:numPr>
+        <w:ind w:left="1440" w:hanging="360"/>
+        <w:rPr>
+          <w:sz w:val="26"/>
+          <w:szCs w:val="26"/>
+        </w:rPr>
+      </w:pPr>
+      <w:r>
+        <w:rPr>
+          <w:rFonts w:ascii="Arial" w:cs="Arial" w:eastAsia="Arial" w:hAnsi="Arial"/>
+          <w:sz w:val="26"/>
+          <w:szCs w:val="26"/>
+          <w:rtl w:val="0"/>
+        </w:rPr>
+        <w:t xml:space="preserve">Rutinas deterministas y automatización</w:t>
       </w:r>
       <w:r>
         <w:rPr>
@@ -7950,7 +7977,7 @@
           <w:szCs w:val="30"/>
           <w:rtl w:val="0"/>
         </w:rPr>
-        <w:t xml:space="preserve">La herramienta atlas_shell ejecuta comandos en A1 y devuelve la salida real; atlas_web_search ofrece búsqueda web. Realtime decide cuándo usarlas y continúa a partir del resultado. OpenClaw interviene en la reserva autenticada de la sesión, pero ninguno de sus agentes procesa por ello la conversación. La antigua herramienta openclaw_agent_consult y la delegación a Luna describen una etapa anterior del proyecto.</w:t>
+        <w:t xml:space="preserve">La herramienta atlas_shell ejecuta comandos en A1 y devuelve la salida real; atlas_web_search ofrece búsqueda web; y atlas_routine administra automatizaciones deterministas. Realtime decide cuándo usar estas herramientas y continúa a partir del resultado. OpenClaw interviene en la reserva autenticada de la sesión, pero ninguno de sus agentes procesa por ello la conversación.</w:t>
       </w:r>
       <w:r>
         <w:rPr>
@@ -8213,7 +8240,7 @@
           <w:szCs w:val="30"/>
           <w:rtl w:val="0"/>
         </w:rPr>
-        <w:t xml:space="preserve">Las consultas de fecha, RAM, almacenamiento, red y servicios ya pueden resolverse con atlas_shell. Las búsquedas utilizan atlas_web_search. Los comandos atlas-* reúnen tareas habituales y documentan sus condiciones. Ante una operación destructiva o ambigua, ATLAS debe verificar la intención y pedir confirmación cuando corresponda; una reconexión nunca debe convertirse en permiso para repetir una acción.</w:t>
+        <w:t xml:space="preserve">Las consultas de fecha, RAM, almacenamiento, red y servicios pueden resolverse con atlas_shell. Las búsquedas utilizan atlas_web_search. Los comandos atlas-* reúnen tareas habituales y atlas-routines permite gestionarlas por SSH. Cuando una frase exacta ya tiene una rutina, WebScreen y atlas-chat la resuelven localmente antes de crear una respuesta de Realtime.</w:t>
       </w:r>
       <w:r>
         <w:rPr>
@@ -8288,7 +8315,90 @@
           <w:szCs w:val="44"/>
           <w:rtl w:val="0"/>
         </w:rPr>
-        <w:t>6.5 Recuperación de conexiones y control de turnos</w:t>
+        <w:t xml:space="preserve">6.5 Rutinas deterministas y automatización</w:t>
+      </w:r>
+      <w:commentRangeEnd w:id="2"/>
+      <w:r>
+        <w:commentReference w:id="2"/>
+      </w:r>
+    </w:p>
+    <w:p>
+      <w:pPr>
+        <w:spacing w:after="240" w:before="240" w:line="276" w:lineRule="auto"/>
+        <w:rPr/>
+      </w:pPr>
+      <w:r>
+        <w:rPr>
+          <w:rFonts w:ascii="Arial" w:cs="Arial" w:eastAsia="Arial" w:hAnsi="Arial"/>
+          <w:b w:val="0"/>
+          <w:bCs w:val="0"/>
+          <w:i w:val="0"/>
+          <w:iCs w:val="0"/>
+          <w:sz w:val="30"/>
+          <w:szCs w:val="30"/>
+          <w:rtl w:val="0"/>
+        </w:rPr>
+        <w:t xml:space="preserve">Las rutinas sirven para tareas recurrentes con poco margen de variación, como consultar la hora o controlar un dispositivo ya identificado. La petición se normaliza y se compara con una frase de activación exacta antes de solicitar una respuesta al modelo. Si coincide, los pasos se ejecutan en la Raspberry Pi. Así se reducen latencia y consumo de tokens y se conserva una respuesta conocida.</w:t>
+      </w:r>
+    </w:p>
+    <w:p>
+      <w:pPr>
+        <w:spacing w:after="240" w:before="240" w:line="276" w:lineRule="auto"/>
+        <w:rPr/>
+      </w:pPr>
+      <w:r>
+        <w:rPr>
+          <w:rFonts w:ascii="Arial" w:cs="Arial" w:eastAsia="Arial" w:hAnsi="Arial"/>
+          <w:b w:val="0"/>
+          <w:bCs w:val="0"/>
+          <w:i w:val="0"/>
+          <w:iCs w:val="0"/>
+          <w:sz w:val="30"/>
+          <w:szCs w:val="30"/>
+          <w:rtl w:val="0"/>
+        </w:rPr>
+        <w:t xml:space="preserve">El registro está en /home/atlas/.atlas/routines/ROUTINES.md: un documento legible con un bloque JSON validado y escrito de forma atómica. Cada definición guarda nombre, descripción, razonamiento de diseño, frases exactas, estado y pasos ordenados. Un paso shell puede capturar una salida en una variable; un paso SAY forma la respuesta oral. Si no existe SAY, el éxito es intencionadamente silencioso.</w:t>
+      </w:r>
+    </w:p>
+    <w:p>
+      <w:pPr>
+        <w:spacing w:after="240" w:before="240" w:line="276" w:lineRule="auto"/>
+        <w:rPr/>
+      </w:pPr>
+      <w:r>
+        <w:rPr>
+          <w:rFonts w:ascii="Arial" w:cs="Arial" w:eastAsia="Arial" w:hAnsi="Arial"/>
+          <w:b w:val="0"/>
+          <w:bCs w:val="0"/>
+          <w:i w:val="0"/>
+          <w:iCs w:val="0"/>
+          <w:sz w:val="30"/>
+          <w:szCs w:val="30"/>
+          <w:rtl w:val="0"/>
+        </w:rPr>
+        <w:t xml:space="preserve">Las rutinas se pueden crear hablando con ATLAS o mediante atlas-routines por SSH. Durante la conversación, el sistema pregunta qué debe hacer, cuál será la frase exacta y qué nombre tendrá. Una acción dependiente del entorno puede probarse antes de guardarse para conservar el comando directo más corto que se haya verificado. Si un paso falla, la secuencia se detiene y registra el resultado. Realtime puede explicarlo o corregir una definición sencilla, pero no repite automáticamente una operación que quizá ya haya producido efectos.</w:t>
+      </w:r>
+    </w:p>
+    <w:p>
+      <w:pPr>
+        <w:keepNext w:val="1"/>
+        <w:pageBreakBefore w:val="0"/>
+        <w:spacing w:after="240" w:before="320" w:lineRule="auto"/>
+        <w:rPr/>
+      </w:pPr>
+      <w:commentRangeStart w:id="2"/>
+      <w:r>
+        <w:rPr>
+          <w:rFonts w:ascii="Arial" w:cs="Arial" w:eastAsia="Arial" w:hAnsi="Arial"/>
+          <w:b w:val="1"/>
+          <w:bCs w:val="1"/>
+          <w:i w:val="1"/>
+          <w:iCs w:val="1"/>
+          <w:sz w:val="44"/>
+          <w:szCs w:val="44"/>
+          <w:rtl w:val="0"/>
+        </w:rPr>
+        <w:t xml:space="preserve">6.6 Recuperación de conexiones y control de turnos</w:t>
       </w:r>
       <w:commentRangeEnd w:id="2"/>
       <w:r>

</xml_diff>

<commit_message>
feat(android): add Tailscale control and permission review
</commit_message>
<xml_diff>
--- a/docs/atlas-teorico-codex.docx
+++ b/docs/atlas-teorico-codex.docx
@@ -785,6 +785,72 @@
           <w:rtl w:val="0"/>
         </w:rPr>
         <w:t>Chat de terminal para pruebas</w:t>
+      </w:r>
+    </w:p>
+    <w:p>
+      <w:pPr>
+        <w:numPr>
+          <w:ilvl w:val="1"/>
+          <w:numId w:val="1"/>
+        </w:numPr>
+        <w:ind w:left="1440" w:hanging="360"/>
+        <w:rPr>
+          <w:sz w:val="26"/>
+          <w:szCs w:val="26"/>
+        </w:rPr>
+      </w:pPr>
+      <w:r>
+        <w:rPr>
+          <w:rFonts w:ascii="Arial" w:cs="Arial" w:eastAsia="Arial" w:hAnsi="Arial"/>
+          <w:sz w:val="26"/>
+          <w:szCs w:val="26"/>
+          <w:rtl w:val="0"/>
+        </w:rPr>
+        <w:t>Aplicación Android y servicio Companion</w:t>
+      </w:r>
+    </w:p>
+    <w:p>
+      <w:pPr>
+        <w:numPr>
+          <w:ilvl w:val="1"/>
+          <w:numId w:val="1"/>
+        </w:numPr>
+        <w:ind w:left="1440" w:hanging="360"/>
+        <w:rPr>
+          <w:sz w:val="26"/>
+          <w:szCs w:val="26"/>
+        </w:rPr>
+      </w:pPr>
+      <w:r>
+        <w:rPr>
+          <w:rFonts w:ascii="Arial" w:cs="Arial" w:eastAsia="Arial" w:hAnsi="Arial"/>
+          <w:sz w:val="26"/>
+          <w:szCs w:val="26"/>
+          <w:rtl w:val="0"/>
+        </w:rPr>
+        <w:t>Red privada Tailscale y emparejamiento</w:t>
+      </w:r>
+    </w:p>
+    <w:p>
+      <w:pPr>
+        <w:numPr>
+          <w:ilvl w:val="1"/>
+          <w:numId w:val="1"/>
+        </w:numPr>
+        <w:ind w:left="1440" w:hanging="360"/>
+        <w:rPr>
+          <w:sz w:val="26"/>
+          <w:szCs w:val="26"/>
+        </w:rPr>
+      </w:pPr>
+      <w:r>
+        <w:rPr>
+          <w:rFonts w:ascii="Arial" w:cs="Arial" w:eastAsia="Arial" w:hAnsi="Arial"/>
+          <w:sz w:val="26"/>
+          <w:szCs w:val="26"/>
+          <w:rtl w:val="0"/>
+        </w:rPr>
+        <w:t>Control nativo y accesibilidad en Android</w:t>
       </w:r>
     </w:p>
     <w:p>
@@ -4776,12 +4842,7 @@
           <w:szCs w:val="30"/>
           <w:rtl w:val="0"/>
         </w:rPr>
-        <w:t xml:space="preserve">ATLAS se puede utilizar desde la terminal, Telegram, WebScreen y la aplicación Android. atlas-chat permite probar la misma ruta Realtime de WebScreen sin micrófono ni síntesis de voz. Telegram conserva su propio canal de OpenClaw. La aplicación permite conversar y administrar A1 desde el móvil. Compartir el ecosistema no implica que todos los canales utilicen el mismo transporte ni la misma presentación.</w:t>
-      </w:r>
-      <w:r>
-        <w:rPr>
-          <w:rtl w:val="0"/>
-        </w:rPr>
+        <w:t>ATLAS se puede utilizar desde la terminal, Telegram, WebScreen y la aplicación Android. atlas-chat permite probar la misma ruta Realtime de WebScreen sin micrófono ni síntesis de voz. Telegram conserva su propio canal de OpenClaw. La aplicación Android se comunica con el servicio Companion de ATLAS A1 a través de la red privada Tailscale y mantiene separadas la conversación, la administración y el control del teléfono. Compartir el ecosistema no implica que todos los canales utilicen el mismo transporte ni la misma presentación.</w:t>
       </w:r>
     </w:p>
     <w:p>
@@ -5082,12 +5143,7 @@
           <w:szCs w:val="30"/>
           <w:rtl w:val="0"/>
         </w:rPr>
-        <w:t xml:space="preserve">Para las tareas habituales de ATLAS OS creé comandos con el prefijo atlas-. La intención era que una persona y el propio agente pudiesen utilizar una interfaz corta y recordable en vez de memorizar varios comandos de systemd, rutas y parámetros. atlas-status resume el dispositivo; atlas-screen controla la pantalla; atlas-app muestra el servicio y el dispositivo emparejado; atlas-rafas diagnostica problemas; y atlas-chat abre el chat de pruebas. Sus manuales se enlazan desde AGENTS.md y el catálogo de comandos.</w:t>
-      </w:r>
-      <w:r>
-        <w:rPr>
-          <w:rtl w:val="0"/>
-        </w:rPr>
+        <w:t>Para las tareas habituales de ATLAS OS creé comandos con el prefijo atlas-. La intención era que una persona y el propio agente pudiesen utilizar una interfaz corta y recordable en vez de memorizar varios comandos de systemd, rutas y parámetros. atlas-status resume el dispositivo; atlas-screen controla la pantalla; atlas-app muestra el servicio, gestiona el emparejamiento y expone atlas-app control para acciones Android estructuradas; atlas-androiduse coordina la automatización visual del teléfono; atlas-rafas diagnostica problemas; y atlas-chat abre el chat de pruebas. Sus manuales se enlazan desde AGENTS.md y el catálogo de comandos.</w:t>
       </w:r>
     </w:p>
     <w:p>
@@ -5205,6 +5261,259 @@
           <w:rtl w:val="0"/>
         </w:rPr>
         <w:t>La versión 1.1.0 incorpora entrada multilínea, historial y sugerencias al escribir / o @. /help muestra los comandos disponibles y @ ayuda a referenciar archivos. Las respuestas se muestran en blanco, mientras que las herramientas y su salida aparecen en gris. Los comandos largos se acortan solo en la vista: /expand permite leerlos completos y /compact cambia ese comportamiento sin alterar lo que se ejecuta. El modo --ephemeral evita incorporar los turnos a la memoria conversacional compartida; no implica borrar por sí solo los registros locales.</w:t>
+      </w:r>
+    </w:p>
+    <w:p>
+      <w:pPr>
+        <w:keepNext w:val="1"/>
+        <w:pageBreakBefore w:val="0"/>
+        <w:spacing w:after="240" w:before="320" w:lineRule="auto"/>
+        <w:rPr/>
+      </w:pPr>
+      <w:r>
+        <w:rPr>
+          <w:rFonts w:ascii="Arial" w:cs="Arial" w:eastAsia="Arial" w:hAnsi="Arial"/>
+          <w:b w:val="1"/>
+          <w:bCs w:val="1"/>
+          <w:i w:val="1"/>
+          <w:iCs w:val="1"/>
+          <w:sz w:val="44"/>
+          <w:szCs w:val="44"/>
+          <w:rtl w:val="0"/>
+        </w:rPr>
+        <w:t>3.6 Aplicación Android y servicio Companion</w:t>
+      </w:r>
+    </w:p>
+    <w:p>
+      <w:pPr>
+        <w:spacing w:after="240" w:before="240" w:line="276" w:lineRule="auto"/>
+        <w:rPr/>
+      </w:pPr>
+      <w:r>
+        <w:rPr>
+          <w:rFonts w:ascii="Arial" w:cs="Arial" w:eastAsia="Arial" w:hAnsi="Arial"/>
+          <w:b w:val="0"/>
+          <w:bCs w:val="0"/>
+          <w:i w:val="0"/>
+          <w:iCs w:val="0"/>
+          <w:sz w:val="30"/>
+          <w:szCs w:val="30"/>
+          <w:rtl w:val="0"/>
+        </w:rPr>
+        <w:t>La aplicación Android convierte el móvil en otro terminal de ATLAS. Su interfaz separa la conversación, las acciones configurables, la terminal, el estado del A1 y los ajustes. La ruta de voz prepara la sesión de gpt-realtime-2.1 al abrir la aplicación y la renueva antes de que alcance su duración máxima; así, mantener pulsado el micrófono no tiene que iniciar toda la conexión. El chat es de texto, muestra el mensaje del usuario de inmediato y recibe la respuesta progresivamente.</w:t>
+      </w:r>
+    </w:p>
+    <w:p>
+      <w:pPr>
+        <w:spacing w:after="240" w:before="240" w:line="276" w:lineRule="auto"/>
+        <w:rPr/>
+      </w:pPr>
+      <w:r>
+        <w:rPr>
+          <w:rFonts w:ascii="Arial" w:cs="Arial" w:eastAsia="Arial" w:hAnsi="Arial"/>
+          <w:b w:val="0"/>
+          <w:bCs w:val="0"/>
+          <w:i w:val="0"/>
+          <w:iCs w:val="0"/>
+          <w:sz w:val="30"/>
+          <w:szCs w:val="30"/>
+          <w:rtl w:val="0"/>
+        </w:rPr>
+        <w:t>La conexión se mantiene mediante un servicio en primer plano mientras el proceso de ATLAS sigue permitido por Android. Esto facilita los widgets y la recuperación al minimizar la aplicación, pero no equivale a una garantía de ejecución indefinida: Android o el fabricante pueden detener procesos por batería, memoria o políticas del sistema. La interfaz muestra por separado el estado del A1 y el de la sesión Realtime para que una conexión activa con la Raspberry Pi no se confunda con una conversación preparada.</w:t>
+      </w:r>
+    </w:p>
+    <w:p>
+      <w:pPr>
+        <w:spacing w:after="240" w:before="240" w:line="276" w:lineRule="auto"/>
+        <w:rPr/>
+      </w:pPr>
+      <w:r>
+        <w:rPr>
+          <w:rFonts w:ascii="Arial" w:cs="Arial" w:eastAsia="Arial" w:hAnsi="Arial"/>
+          <w:b w:val="0"/>
+          <w:bCs w:val="0"/>
+          <w:i w:val="0"/>
+          <w:iCs w:val="0"/>
+          <w:sz w:val="30"/>
+          <w:szCs w:val="30"/>
+          <w:rtl w:val="0"/>
+        </w:rPr>
+        <w:t>Companion 0.2.0 expone el estado, las acciones y una terminal PTY persistente. La PTY no pertenece al WebSocket concreto, por lo que puede retomarse después de minimizar o recrear la actividad. Se cierra tras 300 segundos sin actividad real; las consultas vacías utilizadas para comprobar el enlace no renuevan ese tiempo. La aplicación conserva el último estado válido mientras solicita una lectura nueva, evitando que una interrupción breve deje toda la pantalla sin datos.</w:t>
+      </w:r>
+    </w:p>
+    <w:p>
+      <w:pPr>
+        <w:keepNext w:val="1"/>
+        <w:pageBreakBefore w:val="0"/>
+        <w:spacing w:after="240" w:before="320" w:lineRule="auto"/>
+        <w:rPr/>
+      </w:pPr>
+      <w:r>
+        <w:rPr>
+          <w:rFonts w:ascii="Arial" w:cs="Arial" w:eastAsia="Arial" w:hAnsi="Arial"/>
+          <w:b w:val="1"/>
+          <w:bCs w:val="1"/>
+          <w:i w:val="1"/>
+          <w:iCs w:val="1"/>
+          <w:sz w:val="44"/>
+          <w:szCs w:val="44"/>
+          <w:rtl w:val="0"/>
+        </w:rPr>
+        <w:t>3.7 Red privada Tailscale y emparejamiento</w:t>
+      </w:r>
+    </w:p>
+    <w:p>
+      <w:pPr>
+        <w:spacing w:after="240" w:before="240" w:line="276" w:lineRule="auto"/>
+        <w:rPr/>
+      </w:pPr>
+      <w:r>
+        <w:rPr>
+          <w:rFonts w:ascii="Arial" w:cs="Arial" w:eastAsia="Arial" w:hAnsi="Arial"/>
+          <w:b w:val="0"/>
+          <w:bCs w:val="0"/>
+          <w:i w:val="0"/>
+          <w:iCs w:val="0"/>
+          <w:sz w:val="30"/>
+          <w:szCs w:val="30"/>
+          <w:rtl w:val="0"/>
+        </w:rPr>
+        <w:t>La ruta principal de conexión utiliza una red privada Tailscale compartida por razer, atlas-a1 y s23u. Tailscale cifra el tráfico con WireGuard y trata de establecer una conexión directa entre pares; cuando la topología de red no lo permite, puede recurrir a un relay DERP. Por tanto, la arquitectura evita publicar el Companion en Internet, pero no presupone que todos los enlaces serán físicamente directos.</w:t>
+      </w:r>
+    </w:p>
+    <w:p>
+      <w:pPr>
+        <w:spacing w:after="240" w:before="240" w:line="276" w:lineRule="auto"/>
+        <w:rPr/>
+      </w:pPr>
+      <w:r>
+        <w:rPr>
+          <w:rFonts w:ascii="Arial" w:cs="Arial" w:eastAsia="Arial" w:hAnsi="Arial"/>
+          <w:b w:val="0"/>
+          <w:bCs w:val="0"/>
+          <w:i w:val="0"/>
+          <w:iCs w:val="0"/>
+          <w:sz w:val="30"/>
+          <w:szCs w:val="30"/>
+          <w:rtl w:val="0"/>
+        </w:rPr>
+        <w:t>La aplicación resuelve atlas-a1 mediante MagicDNS y abre wss://atlas-a1:5010/app. Si el WebSocket no está disponible, utiliza una petición HTTPS cifrada al mismo Companion como ruta de recuperación. Cloudflare queda fuera del recorrido principal y solo se conserva como alternativa de emergencia durante la migración. El protocolo de aplicación protege además cada mensaje con AES-GCM, de modo que la pertenencia a la red Tailscale no sustituye el emparejamiento propio de ATLAS.</w:t>
+      </w:r>
+    </w:p>
+    <w:p>
+      <w:pPr>
+        <w:spacing w:after="240" w:before="240" w:line="276" w:lineRule="auto"/>
+        <w:rPr/>
+      </w:pPr>
+      <w:r>
+        <w:rPr>
+          <w:rFonts w:ascii="Arial" w:cs="Arial" w:eastAsia="Arial" w:hAnsi="Arial"/>
+          <w:b w:val="0"/>
+          <w:bCs w:val="0"/>
+          <w:i w:val="0"/>
+          <w:iCs w:val="0"/>
+          <w:sz w:val="30"/>
+          <w:szCs w:val="30"/>
+          <w:rtl w:val="0"/>
+        </w:rPr>
+        <w:t>El emparejamiento continúa siendo local y deliberado. atlas-app pair abre una ventana temporal y muestra un código de seis cifras; el móvil lo introduce tras detectar el A1 por Bluetooth. Ese código no transporta una credencial larga ni mantiene la conexión: autoriza una única entrega del endpoint, el pin del certificado y una clave AES. A partir de entonces, el Companion reconoce un solo dispositivo emparejado y puede invalidar sus credenciales al desemparejarlo.</w:t>
+      </w:r>
+    </w:p>
+    <w:p>
+      <w:pPr>
+        <w:keepNext w:val="1"/>
+        <w:pageBreakBefore w:val="0"/>
+        <w:spacing w:after="240" w:before="320" w:lineRule="auto"/>
+        <w:rPr/>
+      </w:pPr>
+      <w:r>
+        <w:rPr>
+          <w:rFonts w:ascii="Arial" w:cs="Arial" w:eastAsia="Arial" w:hAnsi="Arial"/>
+          <w:b w:val="1"/>
+          <w:bCs w:val="1"/>
+          <w:i w:val="1"/>
+          <w:iCs w:val="1"/>
+          <w:sz w:val="44"/>
+          <w:szCs w:val="44"/>
+          <w:rtl w:val="0"/>
+        </w:rPr>
+        <w:t>3.8 Control nativo y accesibilidad en Android</w:t>
+      </w:r>
+    </w:p>
+    <w:p>
+      <w:pPr>
+        <w:spacing w:after="240" w:before="240" w:line="276" w:lineRule="auto"/>
+        <w:rPr/>
+      </w:pPr>
+      <w:r>
+        <w:rPr>
+          <w:rFonts w:ascii="Arial" w:cs="Arial" w:eastAsia="Arial" w:hAnsi="Arial"/>
+          <w:b w:val="0"/>
+          <w:bCs w:val="0"/>
+          <w:i w:val="0"/>
+          <w:iCs w:val="0"/>
+          <w:sz w:val="30"/>
+          <w:szCs w:val="30"/>
+          <w:rtl w:val="0"/>
+        </w:rPr>
+        <w:t>ATLAS prioriza las interfaces nativas de Android. atlas-app control reúne operaciones estructuradas para consultar o modificar, según los permisos concedidos, llamadas, SMS, contactos, calendario, notificaciones, ubicación y archivos. Una llamada del sistema no se presenta como control visual del teléfono. Algunas operaciones exigen una confirmación, una aplicación predeterminada o un rol especial de Android, y ningún permiso se concede automáticamente.</w:t>
+      </w:r>
+    </w:p>
+    <w:p>
+      <w:pPr>
+        <w:spacing w:after="240" w:before="240" w:line="276" w:lineRule="auto"/>
+        <w:rPr/>
+      </w:pPr>
+      <w:r>
+        <w:rPr>
+          <w:rFonts w:ascii="Arial" w:cs="Arial" w:eastAsia="Arial" w:hAnsi="Arial"/>
+          <w:b w:val="0"/>
+          <w:bCs w:val="0"/>
+          <w:i w:val="0"/>
+          <w:iCs w:val="0"/>
+          <w:sz w:val="30"/>
+          <w:szCs w:val="30"/>
+          <w:rtl w:val="0"/>
+        </w:rPr>
+        <w:t>La automatización visual se reserva para tareas que no ofrecen una API adecuada, como abrir una web y completar una búsqueda. atlas-androiduse ofrece acciones pequeñas y observables: start, status, screenshot, tap, swipe, text, key, launch y stop. AccessibilityService ejecuta gestos, introduce texto y obtiene capturas en las versiones compatibles. Cada captura se incorpora a gpt-realtime-2.1 como una entrada de imagen; el modelo sigue un bucle observar, actuar y volver a observar en vez de asumir que una pulsación ha funcionado.</w:t>
+      </w:r>
+    </w:p>
+    <w:p>
+      <w:pPr>
+        <w:spacing w:after="240" w:before="240" w:line="276" w:lineRule="auto"/>
+        <w:rPr/>
+      </w:pPr>
+      <w:r>
+        <w:rPr>
+          <w:rFonts w:ascii="Arial" w:cs="Arial" w:eastAsia="Arial" w:hAnsi="Arial"/>
+          <w:b w:val="0"/>
+          <w:bCs w:val="0"/>
+          <w:i w:val="0"/>
+          <w:iCs w:val="0"/>
+          <w:sz w:val="30"/>
+          <w:szCs w:val="30"/>
+          <w:rtl w:val="0"/>
+        </w:rPr>
+        <w:t>Mientras la automatización visual está activa, Android muestra una notificación transitoria, un resplandor azul en los bordes y un botón rojo para detenerla. La capa consume la entrada táctil para evitar que el usuario y ATLAS actúen a la vez. Al finalizar o cancelar la tarea desaparecen tanto la capa como la notificación. El servicio de accesibilidad debe habilitarse manualmente en los ajustes del teléfono y el usuario puede retirarlo en cualquier momento.</w:t>
+      </w:r>
+    </w:p>
+    <w:p>
+      <w:pPr>
+        <w:spacing w:after="240" w:before="240" w:line="276" w:lineRule="auto"/>
+        <w:rPr/>
+      </w:pPr>
+      <w:r>
+        <w:rPr>
+          <w:rFonts w:ascii="Arial" w:cs="Arial" w:eastAsia="Arial" w:hAnsi="Arial"/>
+          <w:b w:val="0"/>
+          <w:bCs w:val="0"/>
+          <w:i w:val="0"/>
+          <w:iCs w:val="0"/>
+          <w:sz w:val="30"/>
+          <w:szCs w:val="30"/>
+          <w:rtl w:val="0"/>
+        </w:rPr>
+        <w:t>El teléfono devuelve un error explícito cuando no está conectado o no posee el permiso necesario. Las capturas pueden contener mensajes, nombres o datos privados, por lo que deben mantenerse solo durante el turno y no incorporarse a logs generales. Esta arquitectura se ha documentado y preparado para pruebas, pero todavía no constituye una validación física completa en el S23 Ultra; esa comprobación deberá medir permisos, reconexión, latencia, batería y comportamiento con la aplicación en segundo plano.</w:t>
       </w:r>
     </w:p>
     <w:p>
@@ -5315,18 +5624,6 @@
     </w:p>
     <w:p>
       <w:pPr>
-        <w:spacing w:after="240" w:before="240" w:line="276" w:lineRule="auto"/>
-        <w:rPr/>
-      </w:pPr>
-      <w:r>
-        <w:rPr>
-          <w:rtl w:val="0"/>
-        </w:rPr>
-        <w:t xml:space="preserve">HASTA AQUÍ TODO BIEN </w:t>
-      </w:r>
-    </w:p>
-    <w:p>
-      <w:pPr>
         <w:keepNext w:val="1"/>
         <w:pageBreakBefore w:val="0"/>
         <w:spacing w:after="240" w:before="320" w:lineRule="auto"/>
@@ -5489,12 +5786,7 @@
           <w:szCs w:val="30"/>
           <w:rtl w:val="0"/>
         </w:rPr>
-        <w:t xml:space="preserve">La carpeta .openclaw contiene la configuración del Gateway, credenciales, sesiones, plugins y el workspace. La carpeta .atlas reúne las piezas específicas del dispositivo, entre ellas WebScreen, atlas-chat, la aplicación y su conexión, los modos gráficos, RAFAS y sus backups. Los proyectos creados desde WebScreen se almacenan en un workspace separado para no llenar de pruebas la carpeta principal del agente.</w:t>
-      </w:r>
-      <w:r>
-        <w:rPr>
-          <w:rtl w:val="0"/>
-        </w:rPr>
+        <w:t>La carpeta .openclaw contiene la configuración del Gateway, credenciales, sesiones, plugins y el workspace. La carpeta .atlas reúne las piezas específicas del dispositivo, entre ellas WebScreen, atlas-chat, el servicio Companion 0.2.0, la aplicación y su conexión Tailscale, los modos gráficos, RAFAS y sus backups. Los proyectos creados desde WebScreen se almacenan en un workspace separado para no llenar de pruebas la carpeta principal del agente.</w:t>
       </w:r>
     </w:p>
     <w:p>
@@ -5799,23 +6091,6 @@
         <w:rPr>
           <w:rtl w:val="0"/>
         </w:rPr>
-      </w:r>
-    </w:p>
-    <w:p>
-      <w:pPr>
-        <w:spacing w:after="240" w:before="240" w:line="276" w:lineRule="auto"/>
-        <w:rPr>
-          <w:sz w:val="30"/>
-          <w:szCs w:val="30"/>
-        </w:rPr>
-      </w:pPr>
-      <w:r>
-        <w:rPr>
-          <w:sz w:val="30"/>
-          <w:szCs w:val="30"/>
-          <w:rtl w:val="0"/>
-        </w:rPr>
-        <w:t xml:space="preserve">BASTANTE POCHO HASTA AQUÍ. LO QUE VIENE AQUÍ DE ATLAS WEBSCREEN ESTÁ BIEN.</w:t>
       </w:r>
     </w:p>
     <w:p>
@@ -7758,23 +8033,6 @@
     </w:p>
     <w:p>
       <w:pPr>
-        <w:spacing w:after="240" w:before="240" w:line="276" w:lineRule="auto"/>
-        <w:rPr>
-          <w:sz w:val="30"/>
-          <w:szCs w:val="30"/>
-        </w:rPr>
-      </w:pPr>
-      <w:r>
-        <w:rPr>
-          <w:sz w:val="30"/>
-          <w:szCs w:val="30"/>
-          <w:rtl w:val="0"/>
-        </w:rPr>
-        <w:t xml:space="preserve">HASTA AQUÍ TODO BIEN. FALTA SOLO CAMBIAR A PARTIR DE AQUÍ, EN FUNCIÓN DE CUANDO PROSIGA EL PROYECTO </w:t>
-      </w:r>
-    </w:p>
-    <w:p>
-      <w:pPr>
         <w:keepNext w:val="1"/>
         <w:pageBreakBefore w:val="0"/>
         <w:spacing w:after="240" w:before="320" w:lineRule="auto"/>
@@ -9880,7 +10138,7 @@
           <w:szCs w:val="30"/>
           <w:rtl w:val="0"/>
         </w:rPr>
-        <w:t>Para dispositivos Android, el diagnóstico ADB distingue un equipo desconectado, uno offline y uno sin autorización. Los reintentos tienen un límite y una consulta que agota su tiempo no borra el inventario de dispositivos conocidos. Una clave no autorizada sigue requiriendo aceptación en el teléfono; un intento de recuperación no debe saltarse ese consentimiento.</w:t>
+        <w:t>ADB se conserva para desarrollo y pruebas en emulador, pero no es el canal de control del producto. En uso normal, el S23 Ultra se conecta al Companion mediante Tailscale y el emparejamiento criptográfico de ATLAS. Las acciones nativas se ejecutan dentro de la aplicación y la automatización de interfaz depende del servicio de accesibilidad autorizado por el usuario.</w:t>
       </w:r>
     </w:p>
     <w:p>
@@ -13899,6 +14157,25 @@
           <w:szCs w:val="30"/>
           <w:rtl w:val="0"/>
         </w:rPr>
+        <w:t>La arquitectura móvil se ha verificado en código y mediante las rutas de desarrollo disponibles, pero todavía no se ha completado una prueba física de extremo a extremo en el S23 Ultra. Hasta realizarla, no se puede afirmar que todos los permisos, roles, restricciones de batería, capturas, gestos y reconexiones se comporten igual que en el entorno de pruebas.</w:t>
+      </w:r>
+    </w:p>
+    <w:p>
+      <w:pPr>
+        <w:spacing w:after="240" w:before="240" w:line="276" w:lineRule="auto"/>
+        <w:rPr/>
+      </w:pPr>
+      <w:r>
+        <w:rPr>
+          <w:rFonts w:ascii="Arial" w:cs="Arial" w:eastAsia="Arial" w:hAnsi="Arial"/>
+          <w:b w:val="0"/>
+          <w:bCs w:val="0"/>
+          <w:i w:val="0"/>
+          <w:iCs w:val="0"/>
+          <w:sz w:val="30"/>
+          <w:szCs w:val="30"/>
+          <w:rtl w:val="0"/>
+        </w:rPr>
         <w:t>El objetivo sigue siendo comenzar una respuesta hablada sencilla entre uno y tres segundos, con la sesión preparada; no es una garantía. El 6 de septiembre se probaron dos tandas en Chrome sin interfaz, con contexto completo, WebRTC real y voz marin temporal. Se inyectó el resultado textual del reconocimiento, por lo que la prueba no mide la escucha de la wake word. El evento output_audio_buffer.started señala el inicio del audio remoto, no acredita que se haya oído por los altavoces físicos.</w:t>
       </w:r>
     </w:p>
@@ -14459,12 +14736,7 @@
           <w:szCs w:val="30"/>
           <w:rtl w:val="0"/>
         </w:rPr>
-        <w:t xml:space="preserve">En el prototipo se han relajado algunas barreras para acelerar las pruebas. WebScreen permite tomar control desde la red local sin autenticación y RAFAS abre una terminal root desde un teclado físico. Estas decisiones están justificadas únicamente por un entorno doméstico controlado. La entrega final debería limitar WebScreen a localhost, proteger cualquier acceso remoto, pedir credenciales en RAFAS y aplicar permisos mínimos a cada herramienta.</w:t>
-      </w:r>
-      <w:r>
-        <w:rPr>
-          <w:rtl w:val="0"/>
-        </w:rPr>
+        <w:t>El Companion no se publica como un servicio abierto. La ruta normal requiere pertenecer a la red privada Tailscale, superar el emparejamiento local y poseer las credenciales cifradas que recibe el móvil. Estas capas reducen la exposición, pero no sustituyen una política de mínimos privilegios: un equipo autorizado en la tailnet no obtiene por sí solo permiso para controlar ATLAS ni el teléfono.</w:t>
       </w:r>
     </w:p>
     <w:p>
@@ -14483,12 +14755,7 @@
           <w:szCs w:val="30"/>
           <w:rtl w:val="0"/>
         </w:rPr>
-        <w:t xml:space="preserve">Para comandos peligrosos, la intención es combinar dos reglas. Si el usuario pide explícitamente una acción clara, el agente puede ejecutarla dentro del alcance solicitado. Si la petición es ambigua o la acción es difícil de revertir, debe confirmar. No basta con confiar en que “el modelo ya sabe lo que no debe hacer”; el backend también debe limitar comandos, rutas y operaciones según la herramienta utilizada.</w:t>
-      </w:r>
-      <w:r>
-        <w:rPr>
-          <w:rtl w:val="0"/>
-        </w:rPr>
+        <w:t>Para comandos peligrosos se combinan tres límites: intención explícita del usuario, una herramienta de alcance reducido y confirmación cuando Android o la reversibilidad lo exigen. atlas-app control debe preferir operaciones nativas y tipadas frente a una shell arbitraria. atlas-androiduse solo se inicia para interacción visual, muestra indicadores que no deben ocultarse y se detiene desde el botón rojo o el comando stop.</w:t>
       </w:r>
     </w:p>
     <w:p>
@@ -14537,6 +14804,44 @@
         <w:rPr>
           <w:rtl w:val="0"/>
         </w:rPr>
+      </w:r>
+    </w:p>
+    <w:p>
+      <w:pPr>
+        <w:spacing w:after="240" w:before="240" w:line="276" w:lineRule="auto"/>
+        <w:rPr/>
+      </w:pPr>
+      <w:r>
+        <w:rPr>
+          <w:rFonts w:ascii="Arial" w:cs="Arial" w:eastAsia="Arial" w:hAnsi="Arial"/>
+          <w:b w:val="0"/>
+          <w:bCs w:val="0"/>
+          <w:i w:val="0"/>
+          <w:iCs w:val="0"/>
+          <w:sz w:val="30"/>
+          <w:szCs w:val="30"/>
+          <w:rtl w:val="0"/>
+        </w:rPr>
+        <w:t>AccessibilityService es uno de los permisos más potentes de Android. Puede observar contenido y actuar sobre otras aplicaciones, por lo que la aplicación no intenta concedérselo por sí misma. El usuario lo habilita manualmente, puede revocarlo y conserva una vía visible para interrumpir cada sesión de control. La automatización tampoco debe eludir confirmaciones del sistema, pantallas protegidas ni roles de teléfono o mensajería.</w:t>
+      </w:r>
+    </w:p>
+    <w:p>
+      <w:pPr>
+        <w:spacing w:after="240" w:before="240" w:line="276" w:lineRule="auto"/>
+        <w:rPr/>
+      </w:pPr>
+      <w:r>
+        <w:rPr>
+          <w:rFonts w:ascii="Arial" w:cs="Arial" w:eastAsia="Arial" w:hAnsi="Arial"/>
+          <w:b w:val="0"/>
+          <w:bCs w:val="0"/>
+          <w:i w:val="0"/>
+          <w:iCs w:val="0"/>
+          <w:sz w:val="30"/>
+          <w:szCs w:val="30"/>
+          <w:rtl w:val="0"/>
+        </w:rPr>
+        <w:t>Las claves del emparejamiento deben almacenarse en el almacén seguro de Android y poder rotarse al desemparejar. AES-GCM protege los mensajes del protocolo y TLS protege el transporte, mientras que Tailscale limita qué dispositivos pueden alcanzar el servicio. Son controles complementarios: reutilizar nonces, registrar claves o aceptar una credencial revocada rompería la seguridad aunque el túnel de red siguiese cifrado.</w:t>
       </w:r>
     </w:p>
     <w:p>
@@ -15793,12 +16098,7 @@
           <w:szCs w:val="30"/>
           <w:rtl w:val="0"/>
         </w:rPr>
-        <w:t xml:space="preserve">El proyecto aún no está acabado, pero ya ha superado la fase de concepto. Existe una arquitectura funcional, un sistema operativo reproducible, una interfaz de voz medible, un dispositivo físico y una documentación pública. Los problemas pendientes son concretos y se pueden evaluar: reducir la latencia de herramientas, reforzar la seguridad, mejorar el audio, diseñar la interfaz final y empaquetar la instalación.</w:t>
-      </w:r>
-      <w:r>
-        <w:rPr>
-          <w:rtl w:val="0"/>
-        </w:rPr>
+        <w:t>El proyecto aún no está acabado, pero ya ha superado la fase de concepto. Existe una arquitectura funcional, un sistema operativo reproducible, una interfaz de voz medible, un dispositivo físico y una aplicación Android conectada mediante un Companion propio. El control móvil añade herramientas nativas y una ruta visual observable, aunque su validación física completa en el S23 Ultra continúa pendiente.</w:t>
       </w:r>
     </w:p>
     <w:p>
@@ -16149,6 +16449,63 @@
         <w:rPr>
           <w:rtl w:val="0"/>
         </w:rPr>
+      </w:r>
+    </w:p>
+    <w:p>
+      <w:pPr>
+        <w:spacing w:after="240" w:before="240" w:line="276" w:lineRule="auto"/>
+        <w:rPr/>
+      </w:pPr>
+      <w:r>
+        <w:rPr>
+          <w:rFonts w:ascii="Arial" w:cs="Arial" w:eastAsia="Arial" w:hAnsi="Arial"/>
+          <w:b w:val="0"/>
+          <w:bCs w:val="0"/>
+          <w:i w:val="0"/>
+          <w:iCs w:val="0"/>
+          <w:sz w:val="30"/>
+          <w:szCs w:val="30"/>
+          <w:rtl w:val="0"/>
+        </w:rPr>
+        <w:t>Validar en el S23 Ultra el emparejamiento, la renovación de Realtime, la terminal persistente, los permisos y la recuperación tras restricciones de batería o memoria.</w:t>
+      </w:r>
+    </w:p>
+    <w:p>
+      <w:pPr>
+        <w:spacing w:after="240" w:before="240" w:line="276" w:lineRule="auto"/>
+        <w:rPr/>
+      </w:pPr>
+      <w:r>
+        <w:rPr>
+          <w:rFonts w:ascii="Arial" w:cs="Arial" w:eastAsia="Arial" w:hAnsi="Arial"/>
+          <w:b w:val="0"/>
+          <w:bCs w:val="0"/>
+          <w:i w:val="0"/>
+          <w:iCs w:val="0"/>
+          <w:sz w:val="30"/>
+          <w:szCs w:val="30"/>
+          <w:rtl w:val="0"/>
+        </w:rPr>
+        <w:t>Medir el bucle de control visual con tareas reproducibles, registrar cada acción sin conservar capturas privadas y comprobar que el botón de parada interrumpe cualquier secuencia.</w:t>
+      </w:r>
+    </w:p>
+    <w:p>
+      <w:pPr>
+        <w:spacing w:after="240" w:before="240" w:line="276" w:lineRule="auto"/>
+        <w:rPr/>
+      </w:pPr>
+      <w:r>
+        <w:rPr>
+          <w:rFonts w:ascii="Arial" w:cs="Arial" w:eastAsia="Arial" w:hAnsi="Arial"/>
+          <w:b w:val="0"/>
+          <w:bCs w:val="0"/>
+          <w:i w:val="0"/>
+          <w:iCs w:val="0"/>
+          <w:sz w:val="30"/>
+          <w:szCs w:val="30"/>
+          <w:rtl w:val="0"/>
+        </w:rPr>
+        <w:t>Definir ACL y caducidad de dispositivos en Tailscale, rotación de claves de emparejamiento y una ruta de recuperación que no vuelva a exponer el Companion públicamente.</w:t>
       </w:r>
     </w:p>
     <w:p>
@@ -16761,6 +17118,131 @@
     </w:p>
     <w:p>
       <w:pPr>
+        <w:spacing w:after="80" w:before="80" w:line="252.00000000000003" w:lineRule="auto"/>
+        <w:ind w:left="360" w:hanging="360"/>
+        <w:rPr/>
+      </w:pPr>
+      <w:r>
+        <w:rPr>
+          <w:rFonts w:ascii="Arial" w:cs="Arial" w:eastAsia="Arial" w:hAnsi="Arial"/>
+          <w:sz w:val="24"/>
+          <w:szCs w:val="24"/>
+          <w:rtl w:val="0"/>
+        </w:rPr>
+        <w:t xml:space="preserve">Tailscale. Arquitectura oficial de conectividad entre dispositivos, conexiones directas y relay DERP. </w:t>
+      </w:r>
+      <w:hyperlink r:id="rId51">
+        <w:r>
+          <w:rPr>
+            <w:color w:val="0563C1"/>
+            <w:u w:val="single"/>
+          </w:rPr>
+          <w:t>Device connectivity</w:t>
+        </w:r>
+      </w:hyperlink>
+    </w:p>
+    <w:p>
+      <w:pPr>
+        <w:spacing w:after="80" w:before="80" w:line="252.00000000000003" w:lineRule="auto"/>
+        <w:ind w:left="360" w:hanging="360"/>
+        <w:rPr/>
+      </w:pPr>
+      <w:r>
+        <w:rPr>
+          <w:rFonts w:ascii="Arial" w:cs="Arial" w:eastAsia="Arial" w:hAnsi="Arial"/>
+          <w:sz w:val="24"/>
+          <w:szCs w:val="24"/>
+          <w:rtl w:val="0"/>
+        </w:rPr>
+        <w:t xml:space="preserve">Tailscale. Funcionamiento de conexiones directas y relayed en una tailnet. </w:t>
+      </w:r>
+      <w:hyperlink r:id="rId52">
+        <w:r>
+          <w:rPr>
+            <w:color w:val="0563C1"/>
+            <w:u w:val="single"/>
+          </w:rPr>
+          <w:t>Connection types</w:t>
+        </w:r>
+      </w:hyperlink>
+    </w:p>
+    <w:p>
+      <w:pPr>
+        <w:spacing w:after="80" w:before="80" w:line="252.00000000000003" w:lineRule="auto"/>
+        <w:ind w:left="360" w:hanging="360"/>
+        <w:rPr/>
+      </w:pPr>
+      <w:r>
+        <w:rPr>
+          <w:rFonts w:ascii="Arial" w:cs="Arial" w:eastAsia="Arial" w:hAnsi="Arial"/>
+          <w:sz w:val="24"/>
+          <w:szCs w:val="24"/>
+          <w:rtl w:val="0"/>
+        </w:rPr>
+        <w:t xml:space="preserve">Android Developers. Creación, capacidades, gestos y capturas de un servicio de accesibilidad. </w:t>
+      </w:r>
+      <w:hyperlink r:id="rId53">
+        <w:r>
+          <w:rPr>
+            <w:color w:val="0563C1"/>
+            <w:u w:val="single"/>
+          </w:rPr>
+          <w:t>AccessibilityService</w:t>
+        </w:r>
+      </w:hyperlink>
+    </w:p>
+    <w:p>
+      <w:pPr>
+        <w:spacing w:after="80" w:before="80" w:line="252.00000000000003" w:lineRule="auto"/>
+        <w:ind w:left="360" w:hanging="360"/>
+        <w:rPr/>
+      </w:pPr>
+      <w:r>
+        <w:rPr>
+          <w:rFonts w:ascii="Arial" w:cs="Arial" w:eastAsia="Arial" w:hAnsi="Arial"/>
+          <w:sz w:val="24"/>
+          <w:szCs w:val="24"/>
+          <w:rtl w:val="0"/>
+        </w:rPr>
+        <w:t xml:space="preserve">Android Developers. Tipos y restricciones de servicios en primer plano. </w:t>
+      </w:r>
+      <w:hyperlink r:id="rId54">
+        <w:r>
+          <w:rPr>
+            <w:color w:val="0563C1"/>
+            <w:u w:val="single"/>
+          </w:rPr>
+          <w:t>Foreground service types</w:t>
+        </w:r>
+      </w:hyperlink>
+    </w:p>
+    <w:p>
+      <w:pPr>
+        <w:spacing w:after="80" w:before="80" w:line="252.00000000000003" w:lineRule="auto"/>
+        <w:ind w:left="360" w:hanging="360"/>
+        <w:rPr/>
+      </w:pPr>
+      <w:r>
+        <w:rPr>
+          <w:rFonts w:ascii="Arial" w:cs="Arial" w:eastAsia="Arial" w:hAnsi="Arial"/>
+          <w:sz w:val="24"/>
+          <w:szCs w:val="24"/>
+          <w:rtl w:val="0"/>
+        </w:rPr>
+        <w:t xml:space="preserve">OpenAI. Conversaciones Realtime, duración de sesión, function calling y entrada de imágenes. </w:t>
+      </w:r>
+      <w:hyperlink r:id="rId30">
+        <w:r>
+          <w:rPr>
+            <w:color w:val="0563C1"/>
+            <w:u w:val="single"/>
+          </w:rPr>
+          <w:t>Realtime conversations</w:t>
+        </w:r>
+      </w:hyperlink>
+    </w:p>
+    <w:p>
+      <w:pPr>
         <w:keepNext w:val="1"/>
         <w:pageBreakBefore w:val="1"/>
         <w:spacing w:after="240" w:before="360" w:lineRule="auto"/>
@@ -17322,6 +17804,86 @@
         <w:rPr>
           <w:rtl w:val="0"/>
         </w:rPr>
+      </w:r>
+    </w:p>
+    <w:p>
+      <w:pPr>
+        <w:numPr>
+          <w:ilvl w:val="0"/>
+          <w:numId w:val="2"/>
+        </w:numPr>
+        <w:spacing w:after="60" w:before="60" w:line="276" w:lineRule="auto"/>
+        <w:ind w:left="720" w:hanging="360"/>
+        <w:rPr/>
+      </w:pPr>
+      <w:r>
+        <w:rPr>
+          <w:rFonts w:ascii="Arial" w:cs="Arial" w:eastAsia="Arial" w:hAnsi="Arial"/>
+          <w:sz w:val="30"/>
+          <w:szCs w:val="30"/>
+          <w:rtl w:val="0"/>
+        </w:rPr>
+        <w:t>Android SDK, Java, WebView y AccessibilityService para la aplicación móvil, sus permisos y la automatización visual autorizada.</w:t>
+      </w:r>
+    </w:p>
+    <w:p>
+      <w:pPr>
+        <w:numPr>
+          <w:ilvl w:val="0"/>
+          <w:numId w:val="2"/>
+        </w:numPr>
+        <w:spacing w:after="60" w:before="60" w:line="276" w:lineRule="auto"/>
+        <w:ind w:left="720" w:hanging="360"/>
+        <w:rPr/>
+      </w:pPr>
+      <w:r>
+        <w:rPr>
+          <w:rFonts w:ascii="Arial" w:cs="Arial" w:eastAsia="Arial" w:hAnsi="Arial"/>
+          <w:sz w:val="30"/>
+          <w:szCs w:val="30"/>
+          <w:rtl w:val="0"/>
+        </w:rPr>
+        <w:t>Tailscale, WireGuard, MagicDNS y DERP para la red privada entre razer, atlas-a1 y s23u.</w:t>
+      </w:r>
+    </w:p>
+    <w:p>
+      <w:pPr>
+        <w:numPr>
+          <w:ilvl w:val="0"/>
+          <w:numId w:val="2"/>
+        </w:numPr>
+        <w:spacing w:after="60" w:before="60" w:line="276" w:lineRule="auto"/>
+        <w:ind w:left="720" w:hanging="360"/>
+        <w:rPr/>
+      </w:pPr>
+      <w:r>
+        <w:rPr>
+          <w:rFonts w:ascii="Arial" w:cs="Arial" w:eastAsia="Arial" w:hAnsi="Arial"/>
+          <w:sz w:val="30"/>
+          <w:szCs w:val="30"/>
+          <w:rtl w:val="0"/>
+        </w:rPr>
+        <w:t>OkHttp, WebSocket, TLS y AES-GCM para el transporte persistente y el cifrado del protocolo de la aplicación.</w:t>
+      </w:r>
+    </w:p>
+    <w:p>
+      <w:pPr>
+        <w:numPr>
+          <w:ilvl w:val="0"/>
+          <w:numId w:val="2"/>
+        </w:numPr>
+        <w:spacing w:after="60" w:before="60" w:line="276" w:lineRule="auto"/>
+        <w:ind w:left="720" w:hanging="360"/>
+        <w:rPr/>
+      </w:pPr>
+      <w:r>
+        <w:rPr>
+          <w:rFonts w:ascii="Arial" w:cs="Arial" w:eastAsia="Arial" w:hAnsi="Arial"/>
+          <w:sz w:val="30"/>
+          <w:szCs w:val="30"/>
+          <w:rtl w:val="0"/>
+        </w:rPr>
+        <w:t>ATLAS Companion 0.2.0 para emparejamiento, estado, acciones Android y terminal PTY persistente.</w:t>
       </w:r>
     </w:p>
     <w:p>

</xml_diff>

<commit_message>
feat(android): harden phone control and realtime integration
</commit_message>
<xml_diff>
--- a/docs/atlas-teorico-codex.docx
+++ b/docs/atlas-teorico-codex.docx
@@ -5286,59 +5286,50 @@
     </w:p>
     <w:p>
       <w:pPr>
+        <w:pStyle w:val="Normal"/>
         <w:spacing w:after="240" w:before="240" w:line="276" w:lineRule="auto"/>
         <w:rPr/>
       </w:pPr>
       <w:r>
         <w:rPr>
-          <w:rFonts w:ascii="Arial" w:cs="Arial" w:eastAsia="Arial" w:hAnsi="Arial"/>
+          <w:rFonts w:ascii="Arial" w:hAnsi="Arial"/>
           <w:b w:val="0"/>
-          <w:bCs w:val="0"/>
           <w:i w:val="0"/>
-          <w:iCs w:val="0"/>
-          <w:sz w:val="30"/>
-          <w:szCs w:val="30"/>
-          <w:rtl w:val="0"/>
-        </w:rPr>
-        <w:t>La aplicación Android convierte el móvil en otro terminal de ATLAS. Su interfaz separa la conversación, las acciones configurables, la terminal, el estado del A1 y los ajustes. La ruta de voz prepara la sesión de gpt-realtime-2.1 al abrir la aplicación y la renueva antes de que alcance su duración máxima; así, mantener pulsado el micrófono no tiene que iniciar toda la conexión. El chat es de texto, muestra el mensaje del usuario de inmediato y recibe la respuesta progresivamente.</w:t>
-      </w:r>
-    </w:p>
-    <w:p>
-      <w:pPr>
+          <w:sz w:val="30"/>
+        </w:rPr>
+        <w:t>La aplicación Android convierte el móvil en otro terminal de ATLAS. Su interfaz separa la conversación, las acciones configurables, la terminal, el estado del A1 y los ajustes. La ruta de voz prepara gpt-realtime-2.1 al mostrar la aplicación, antes de pulsar el micrófono. Al enviarla a segundo plano libera WebRTC para reducir el consumo y vuelve a prepararlo al regresar. El chat es de texto, muestra el mensaje del usuario de inmediato y recibe la respuesta progresivamente.</w:t>
+      </w:r>
+    </w:p>
+    <w:p>
+      <w:pPr>
+        <w:pStyle w:val="Normal"/>
         <w:spacing w:after="240" w:before="240" w:line="276" w:lineRule="auto"/>
         <w:rPr/>
       </w:pPr>
       <w:r>
         <w:rPr>
-          <w:rFonts w:ascii="Arial" w:cs="Arial" w:eastAsia="Arial" w:hAnsi="Arial"/>
+          <w:rFonts w:ascii="Arial" w:hAnsi="Arial"/>
           <w:b w:val="0"/>
-          <w:bCs w:val="0"/>
           <w:i w:val="0"/>
-          <w:iCs w:val="0"/>
-          <w:sz w:val="30"/>
-          <w:szCs w:val="30"/>
-          <w:rtl w:val="0"/>
-        </w:rPr>
-        <w:t>La conexión se mantiene mediante un servicio en primer plano mientras el proceso de ATLAS sigue permitido por Android. Esto facilita los widgets y la recuperación al minimizar la aplicación, pero no equivale a una garantía de ejecución indefinida: Android o el fabricante pueden detener procesos por batería, memoria o políticas del sistema. La interfaz muestra por separado el estado del A1 y el de la sesión Realtime para que una conexión activa con la Raspberry Pi no se confunda con una conversación preparada.</w:t>
-      </w:r>
-    </w:p>
-    <w:p>
-      <w:pPr>
+          <w:sz w:val="30"/>
+        </w:rPr>
+        <w:t>La conexión con A1 se mantiene mediante un servicio en primer plano mientras Android permite ejecutar el proceso. El WebSocket privado continúa activo al minimizar la aplicación, de modo que los widgets, el estado y la terminal no dependen de mantener Realtime abierto. Android o el fabricante todavía pueden detener el proceso por batería, memoria o una orden de forzar detención. La interfaz distingue el estado del A1 del estado de Realtime para que una conexión con la Raspberry Pi no se confunda con una conversación ya preparada.</w:t>
+      </w:r>
+    </w:p>
+    <w:p>
+      <w:pPr>
+        <w:pStyle w:val="Normal"/>
         <w:spacing w:after="240" w:before="240" w:line="276" w:lineRule="auto"/>
         <w:rPr/>
       </w:pPr>
       <w:r>
         <w:rPr>
-          <w:rFonts w:ascii="Arial" w:cs="Arial" w:eastAsia="Arial" w:hAnsi="Arial"/>
+          <w:rFonts w:ascii="Arial" w:hAnsi="Arial"/>
           <w:b w:val="0"/>
-          <w:bCs w:val="0"/>
           <w:i w:val="0"/>
-          <w:iCs w:val="0"/>
-          <w:sz w:val="30"/>
-          <w:szCs w:val="30"/>
-          <w:rtl w:val="0"/>
-        </w:rPr>
-        <w:t>Companion 0.2.0 expone el estado, las acciones y una terminal PTY persistente. La PTY no pertenece al WebSocket concreto, por lo que puede retomarse después de minimizar o recrear la actividad. Se cierra tras 300 segundos sin actividad real; las consultas vacías utilizadas para comprobar el enlace no renuevan ese tiempo. La aplicación conserva el último estado válido mientras solicita una lectura nueva, evitando que una interrupción breve deje toda la pantalla sin datos.</w:t>
+          <w:sz w:val="30"/>
+        </w:rPr>
+        <w:t>Companion 0.2.1 expone el estado, las acciones y una terminal PTY persistente. Procesa las peticiones cifradas de forma concurrente y serializa sus respuestas, por lo que puede recibir una respuesta del teléfono mientras la orden original sigue esperando sin bloquear el WebSocket. La PTY no pertenece a una conexión concreta y puede retomarse tras minimizar o recrear la actividad. Se cierra después de 300 segundos sin actividad real, y las consultas vacías de enlace no renuevan ese tiempo. La aplicación conserva el último estado válido mientras solicita una lectura nueva.</w:t>
       </w:r>
     </w:p>
     <w:p>
@@ -5383,21 +5374,18 @@
     </w:p>
     <w:p>
       <w:pPr>
+        <w:pStyle w:val="Normal"/>
         <w:spacing w:after="240" w:before="240" w:line="276" w:lineRule="auto"/>
         <w:rPr/>
       </w:pPr>
       <w:r>
         <w:rPr>
-          <w:rFonts w:ascii="Arial" w:cs="Arial" w:eastAsia="Arial" w:hAnsi="Arial"/>
+          <w:rFonts w:ascii="Arial" w:hAnsi="Arial"/>
           <w:b w:val="0"/>
-          <w:bCs w:val="0"/>
           <w:i w:val="0"/>
-          <w:iCs w:val="0"/>
-          <w:sz w:val="30"/>
-          <w:szCs w:val="30"/>
-          <w:rtl w:val="0"/>
-        </w:rPr>
-        <w:t>La aplicación resuelve atlas-a1 mediante MagicDNS y abre wss://atlas-a1:5010/app. Si el WebSocket no está disponible, utiliza una petición HTTPS cifrada al mismo Companion como ruta de recuperación. Cloudflare queda fuera del recorrido principal y solo se conserva como alternativa de emergencia durante la migración. El protocolo de aplicación protege además cada mensaje con AES-GCM, de modo que la pertenencia a la red Tailscale no sustituye el emparejamiento propio de ATLAS.</w:t>
+          <w:sz w:val="30"/>
+        </w:rPr>
+        <w:t>La aplicación resuelve atlas-a1 mediante MagicDNS y abre wss://atlas-a1:5010/app. Si el WebSocket no está disponible, utiliza una petición HTTPS cifrada al mismo Companion como ruta de recuperación. Cloudflare queda fuera del recorrido principal y no se activa automáticamente ante un fallo de Tailscale; solo puede elegirse como compatibilidad explícita. El protocolo de aplicación protege además cada mensaje con AES-GCM, de modo que pertenecer a la red Tailscale no sustituye el emparejamiento propio de ATLAS.</w:t>
       </w:r>
     </w:p>
     <w:p>
@@ -5461,59 +5449,50 @@
     </w:p>
     <w:p>
       <w:pPr>
+        <w:pStyle w:val="Normal"/>
         <w:spacing w:after="240" w:before="240" w:line="276" w:lineRule="auto"/>
         <w:rPr/>
       </w:pPr>
       <w:r>
         <w:rPr>
-          <w:rFonts w:ascii="Arial" w:cs="Arial" w:eastAsia="Arial" w:hAnsi="Arial"/>
+          <w:rFonts w:ascii="Arial" w:hAnsi="Arial"/>
           <w:b w:val="0"/>
-          <w:bCs w:val="0"/>
           <w:i w:val="0"/>
-          <w:iCs w:val="0"/>
-          <w:sz w:val="30"/>
-          <w:szCs w:val="30"/>
-          <w:rtl w:val="0"/>
-        </w:rPr>
-        <w:t>La automatización visual se reserva para tareas que no ofrecen una API adecuada, como abrir una web y completar una búsqueda. atlas-androiduse ofrece acciones pequeñas y observables: start, status, screenshot, tap, swipe, text, key, launch y stop. AccessibilityService ejecuta gestos, introduce texto y obtiene capturas en las versiones compatibles. Cada captura se incorpora a gpt-realtime-2.1 como una entrada de imagen; el modelo sigue un bucle observar, actuar y volver a observar en vez de asumir que una pulsación ha funcionado.</w:t>
-      </w:r>
-    </w:p>
-    <w:p>
-      <w:pPr>
+          <w:sz w:val="30"/>
+        </w:rPr>
+        <w:t>La automatización visual se reserva para tareas que no ofrecen una API adecuada, como abrir una web y completar una búsqueda. atlas-androiduse ofrece acciones pequeñas y observables: start, status, screenshot, tree, tap, long-press, swipe, text, key, launch, wait y stop. Los gestos utilizan coordenadas normalizadas entre 0 y 1 y el árbol oculta los campos de contraseña y sus descendientes. En Android 13 o superior, las aplicaciones se abren mediante IntentSender para no confundir las restricciones de visibilidad de paquetes con una ausencia real. Cada captura se incorpora a gpt-realtime-2.1 como una entrada de imagen y el modelo vuelve a observar después de actuar.</w:t>
+      </w:r>
+    </w:p>
+    <w:p>
+      <w:pPr>
+        <w:pStyle w:val="Normal"/>
         <w:spacing w:after="240" w:before="240" w:line="276" w:lineRule="auto"/>
         <w:rPr/>
       </w:pPr>
       <w:r>
         <w:rPr>
-          <w:rFonts w:ascii="Arial" w:cs="Arial" w:eastAsia="Arial" w:hAnsi="Arial"/>
+          <w:rFonts w:ascii="Arial" w:hAnsi="Arial"/>
           <w:b w:val="0"/>
-          <w:bCs w:val="0"/>
           <w:i w:val="0"/>
-          <w:iCs w:val="0"/>
-          <w:sz w:val="30"/>
-          <w:szCs w:val="30"/>
-          <w:rtl w:val="0"/>
-        </w:rPr>
-        <w:t>Mientras la automatización visual está activa, Android muestra una notificación transitoria, un resplandor azul en los bordes y un botón rojo para detenerla. La capa consume la entrada táctil para evitar que el usuario y ATLAS actúen a la vez. Al finalizar o cancelar la tarea desaparecen tanto la capa como la notificación. El servicio de accesibilidad debe habilitarse manualmente en los ajustes del teléfono y el usuario puede retirarlo en cualquier momento.</w:t>
-      </w:r>
-    </w:p>
-    <w:p>
-      <w:pPr>
+          <w:sz w:val="30"/>
+        </w:rPr>
+        <w:t>Mientras la automatización visual está activa, Android muestra una notificación transitoria, un resplandor azul en los bordes y un botón rojo para detenerla. La capa bloquea el tacto del usuario, pero se vuelve invisible durante 80 milisegundos antes de cada gesto inyectado en One UI para no interceptarlo; al terminar recupera el bloqueo. Al finalizar o cancelar la tarea desaparecen la capa y la notificación. El servicio de accesibilidad se habilita manualmente en los ajustes del teléfono y el usuario puede retirarlo en cualquier momento.</w:t>
+      </w:r>
+    </w:p>
+    <w:p>
+      <w:pPr>
+        <w:pStyle w:val="Normal"/>
         <w:spacing w:after="240" w:before="240" w:line="276" w:lineRule="auto"/>
         <w:rPr/>
       </w:pPr>
       <w:r>
         <w:rPr>
-          <w:rFonts w:ascii="Arial" w:cs="Arial" w:eastAsia="Arial" w:hAnsi="Arial"/>
+          <w:rFonts w:ascii="Arial" w:hAnsi="Arial"/>
           <w:b w:val="0"/>
-          <w:bCs w:val="0"/>
           <w:i w:val="0"/>
-          <w:iCs w:val="0"/>
-          <w:sz w:val="30"/>
-          <w:szCs w:val="30"/>
-          <w:rtl w:val="0"/>
-        </w:rPr>
-        <w:t>El teléfono devuelve un error explícito cuando no está conectado o no posee el permiso necesario. Las capturas pueden contener mensajes, nombres o datos privados, por lo que deben mantenerse solo durante el turno y no incorporarse a logs generales. Esta arquitectura se ha documentado y preparado para pruebas, pero todavía no constituye una validación física completa en el S23 Ultra; esa comprobación deberá medir permisos, reconexión, latencia, batería y comportamiento con la aplicación en segundo plano.</w:t>
+          <w:sz w:val="30"/>
+        </w:rPr>
+        <w:t>El teléfono devuelve un error explícito cuando no está conectado o no posee el permiso necesario. Las capturas pueden contener mensajes, nombres o datos privados, por lo que se mantienen dentro del turno y no se incorporan a logs generales. En el S23 Ultra se comprobaron la conexión Tailscale, las herramientas nativas no intrusivas, Realtime, voz por pulsación, chat, capturas, árbol de accesibilidad, gestos, introducción de texto, navegación y parada. No se realizaron llamadas ni SMS, no se tomó ninguna foto y no se cambió la red Wi-Fi.</w:t>
       </w:r>
     </w:p>
     <w:p>
@@ -5772,21 +5751,18 @@
     </w:p>
     <w:p>
       <w:pPr>
+        <w:pStyle w:val="Normal"/>
         <w:spacing w:after="240" w:before="240" w:line="276" w:lineRule="auto"/>
         <w:rPr/>
       </w:pPr>
       <w:r>
         <w:rPr>
-          <w:rFonts w:ascii="Arial" w:cs="Arial" w:eastAsia="Arial" w:hAnsi="Arial"/>
+          <w:rFonts w:ascii="Arial" w:hAnsi="Arial"/>
           <w:b w:val="0"/>
-          <w:bCs w:val="0"/>
           <w:i w:val="0"/>
-          <w:iCs w:val="0"/>
-          <w:sz w:val="30"/>
-          <w:szCs w:val="30"/>
-          <w:rtl w:val="0"/>
-        </w:rPr>
-        <w:t>La carpeta .openclaw contiene la configuración del Gateway, credenciales, sesiones, plugins y el workspace. La carpeta .atlas reúne las piezas específicas del dispositivo, entre ellas WebScreen, atlas-chat, el servicio Companion 0.2.0, la aplicación y su conexión Tailscale, los modos gráficos, RAFAS y sus backups. Los proyectos creados desde WebScreen se almacenan en un workspace separado para no llenar de pruebas la carpeta principal del agente.</w:t>
+          <w:sz w:val="30"/>
+        </w:rPr>
+        <w:t>La carpeta .openclaw contiene la configuración del Gateway, credenciales, sesiones, plugins y el workspace. La carpeta .atlas reúne las piezas específicas del dispositivo, entre ellas WebScreen, atlas-chat, el servicio Companion 0.2.1, la aplicación y su conexión Tailscale, los modos gráficos, RAFAS y sus backups. Los proyectos creados desde WebScreen se almacenan en un workspace separado para no llenar de pruebas la carpeta principal del agente.</w:t>
       </w:r>
     </w:p>
     <w:p>
@@ -6800,26 +6776,18 @@
     </w:p>
     <w:p>
       <w:pPr>
+        <w:pStyle w:val="Normal"/>
         <w:spacing w:after="240" w:before="240" w:line="276" w:lineRule="auto"/>
         <w:rPr/>
       </w:pPr>
       <w:r>
         <w:rPr>
-          <w:rFonts w:ascii="Arial" w:cs="Arial" w:eastAsia="Arial" w:hAnsi="Arial"/>
+          <w:rFonts w:ascii="Arial" w:hAnsi="Arial"/>
           <w:b w:val="0"/>
-          <w:bCs w:val="0"/>
           <w:i w:val="0"/>
-          <w:iCs w:val="0"/>
-          <w:sz w:val="30"/>
-          <w:szCs w:val="30"/>
-          <w:rtl w:val="0"/>
-        </w:rPr>
-        <w:t xml:space="preserve">Una conversación natural no está formada por turnos perfectamente aislados. El usuario puede interrumpir, corregirse o responder sin repetir la wake word. WebScreen añadió una ventana de seguimiento de diez segundos. En la implementación actual se abre después de una respuesta normal, aunque ATLAS no haya terminado con una pregunta; si el usuario comienza dentro de la ventana, su frase conserva el contexto del turno anterior.</w:t>
-      </w:r>
-      <w:r>
-        <w:rPr>
-          <w:rtl w:val="0"/>
-        </w:rPr>
+          <w:sz w:val="30"/>
+        </w:rPr>
+        <w:t>Una conversación natural no está formada por turnos perfectamente aislados. El usuario puede interrumpir o corregirse mientras ATLAS responde. En una etapa anterior, WebScreen abrió durante diez segundos una ventana que permitía continuar sin repetir la wake word. La prueba resultó menos predecible de lo deseado y se retiró: en la implementación actual cada petición nueva comienza al decir ATLAS, mientras una interrupción sigue cancelando la respuesta activa.</w:t>
       </w:r>
     </w:p>
     <w:p>
@@ -8319,6 +8287,22 @@
     </w:p>
     <w:p>
       <w:pPr>
+        <w:pStyle w:val="Normal"/>
+        <w:spacing w:after="240" w:before="240" w:line="276" w:lineRule="auto"/>
+        <w:rPr/>
+      </w:pPr>
+      <w:r>
+        <w:rPr>
+          <w:rFonts w:ascii="Arial" w:hAnsi="Arial"/>
+          <w:b w:val="0"/>
+          <w:i w:val="0"/>
+          <w:sz w:val="30"/>
+        </w:rPr>
+        <w:t>La wake word continúa siendo ATLAS. El detector del navegador valida la palabra exacta sin exigir silencio previo y reutiliza el texto que Chrome reconoce para formar la petición. Cada turno nuevo vuelve a exigir la palabra ATLAS; así, el ruido posterior a una respuesta no abre otra petición por accidente. El sistema conserva la frase que sigue a la wake word y descarta resultados parciales y finales equivalentes.</w:t>
+      </w:r>
+    </w:p>
+    <w:p>
+      <w:pPr>
         <w:spacing w:after="240" w:before="240" w:line="276" w:lineRule="auto"/>
         <w:rPr/>
       </w:pPr>
@@ -8333,60 +8317,28 @@
           <w:szCs w:val="30"/>
           <w:rtl w:val="0"/>
         </w:rPr>
-        <w:t xml:space="preserve">La wake word continúa siendo ATLAS. El detector del navegador valida la palabra exacta sin exigir silencio previo y reutiliza el texto que Chrome reconoce para formar la petición. La misma captura sirve para el seguimiento de diez segundos. Esto evita depender de que una segunda transcripción vuelva a reconocer correctamente una frase que Chrome ya había entendido. Los navegadores sin esa capacidad necesitan su ruta alternativa y deben verificarse por separado.</w:t>
-      </w:r>
-      <w:r>
-        <w:rPr>
-          <w:rtl w:val="0"/>
-        </w:rPr>
-      </w:r>
-    </w:p>
-    <w:p>
-      <w:pPr>
+        <w:t xml:space="preserve">Al detectar la wake word ya no reproduce “dime”. El sistema conserva la continuación de expresiones como “ATLAS, qué hora es”, une los fragmentos de la misma frase y evita enviar dos turnos por recibir resultados parciales y finales equivalentes. La detección, el cierre de la frase y el envío al modelo son estados distintos; aceptar la palabra no significa que la petición ya haya terminado.</w:t>
+      </w:r>
+      <w:r>
+        <w:rPr>
+          <w:rtl w:val="0"/>
+        </w:rPr>
+      </w:r>
+    </w:p>
+    <w:p>
+      <w:pPr>
+        <w:pStyle w:val="Normal"/>
         <w:spacing w:after="240" w:before="240" w:line="276" w:lineRule="auto"/>
         <w:rPr/>
       </w:pPr>
       <w:r>
         <w:rPr>
-          <w:rFonts w:ascii="Arial" w:cs="Arial" w:eastAsia="Arial" w:hAnsi="Arial"/>
+          <w:rFonts w:ascii="Arial" w:hAnsi="Arial"/>
           <w:b w:val="0"/>
-          <w:bCs w:val="0"/>
           <w:i w:val="0"/>
-          <w:iCs w:val="0"/>
-          <w:sz w:val="30"/>
-          <w:szCs w:val="30"/>
-          <w:rtl w:val="0"/>
-        </w:rPr>
-        <w:t xml:space="preserve">Al detectar la wake word ya no reproduce “dime”. El sistema conserva la continuación de expresiones como “ATLAS, qué hora es”, une los fragmentos de la misma frase y evita enviar dos turnos por recibir resultados parciales y finales equivalentes. La detección, el cierre de la frase y el envío al modelo son estados distintos; aceptar la palabra no significa que la petición ya haya terminado.</w:t>
-      </w:r>
-      <w:r>
-        <w:rPr>
-          <w:rtl w:val="0"/>
-        </w:rPr>
-      </w:r>
-    </w:p>
-    <w:p>
-      <w:pPr>
-        <w:spacing w:after="240" w:before="240" w:line="276" w:lineRule="auto"/>
-        <w:rPr/>
-      </w:pPr>
-      <w:r>
-        <w:rPr>
-          <w:rFonts w:ascii="Arial" w:cs="Arial" w:eastAsia="Arial" w:hAnsi="Arial"/>
-          <w:b w:val="0"/>
-          <w:bCs w:val="0"/>
-          <w:i w:val="0"/>
-          <w:iCs w:val="0"/>
-          <w:sz w:val="30"/>
-          <w:szCs w:val="30"/>
-          <w:rtl w:val="0"/>
-        </w:rPr>
-        <w:t xml:space="preserve">En los clientes que permiten interrupción por voz, la cancelación detiene la salida y el turno activo sin abrir otra sesión innecesariamente. Si el proveedor indica que ya no existe una respuesta activa, se trata como una cancelación ya resuelta, no como un fallo que obliga a reconectar. En el A1 con altavoces se prioriza la protección contra el eco descrita antes. Al terminar, la ventana de seguimiento permite continuar sin repetir ATLAS.</w:t>
-      </w:r>
-      <w:r>
-        <w:rPr>
-          <w:rtl w:val="0"/>
-        </w:rPr>
+          <w:sz w:val="30"/>
+        </w:rPr>
+        <w:t>En los clientes que permiten interrupción por voz, la cancelación detiene la salida y el turno activo sin abrir otra sesión innecesariamente. Si el proveedor indica que ya no existe una respuesta activa, se trata como una cancelación ya resuelta, no como un fallo que obliga a reconectar. En el A1 con altavoces se prioriza la protección contra el eco descrita antes. Al terminar una respuesta, el detector vuelve al estado de espera y exige de nuevo la palabra ATLAS.</w:t>
       </w:r>
     </w:p>
     <w:p>
@@ -14124,40 +14076,34 @@
     </w:p>
     <w:p>
       <w:pPr>
+        <w:pStyle w:val="Normal"/>
         <w:spacing w:after="240" w:before="240" w:line="276" w:lineRule="auto"/>
         <w:rPr/>
       </w:pPr>
       <w:r>
         <w:rPr>
-          <w:rFonts w:ascii="Arial" w:cs="Arial" w:eastAsia="Arial" w:hAnsi="Arial"/>
+          <w:rFonts w:ascii="Arial" w:hAnsi="Arial"/>
           <w:b w:val="0"/>
-          <w:bCs w:val="0"/>
           <w:i w:val="0"/>
-          <w:iCs w:val="0"/>
-          <w:sz w:val="30"/>
-          <w:szCs w:val="30"/>
-          <w:rtl w:val="0"/>
-        </w:rPr>
-        <w:t>La revisión superó 277 pruebas de regresión: 70 del backend Python, 125 de JavaScript y 82 del sistema. Las tandas no registraron errores de JavaScript. Un heartbeat perdido mantuvo la conexión y un error 401 simulado renovó el acceso y Realtime. Con el proveedor real, cancelar antes de recibir la confirmación produjo una única petición, cancelada por su identificador, sin reactivar la respuesta. También se verificaron la ruta de audio Bluetooth y el enlace ADB a una televisión autorizada. Son comprobaciones concretas, no una validación de cualquier dispositivo o red.</w:t>
-      </w:r>
-    </w:p>
-    <w:p>
-      <w:pPr>
+          <w:sz w:val="30"/>
+        </w:rPr>
+        <w:t>La tanda final del 8 de septiembre superó 492 comprobaciones automatizadas: 26 contratos Android, 16 pruebas de Companion, 8 de los wrappers, 19 de atlas-chat, 91 del backend WebScreen y 332 del cliente y el kiosco. También pasaron lint y build Android. En el dispositivo físico comprobé el enlace directo por Tailscale, la RPC reentrante y una sesión Realtime preparada antes de pulsar el micrófono. Voz por pulsación y chat completaron turnos reales sin el error de fuente de audio.</w:t>
+      </w:r>
+    </w:p>
+    <w:p>
+      <w:pPr>
+        <w:pStyle w:val="Normal"/>
         <w:spacing w:after="240" w:before="240" w:line="276" w:lineRule="auto"/>
         <w:rPr/>
       </w:pPr>
       <w:r>
         <w:rPr>
-          <w:rFonts w:ascii="Arial" w:cs="Arial" w:eastAsia="Arial" w:hAnsi="Arial"/>
+          <w:rFonts w:ascii="Arial" w:hAnsi="Arial"/>
           <w:b w:val="0"/>
-          <w:bCs w:val="0"/>
           <w:i w:val="0"/>
-          <w:iCs w:val="0"/>
-          <w:sz w:val="30"/>
-          <w:szCs w:val="30"/>
-          <w:rtl w:val="0"/>
-        </w:rPr>
-        <w:t>La arquitectura móvil se ha verificado en código y mediante las rutas de desarrollo disponibles, pero todavía no se ha completado una prueba física de extremo a extremo en el S23 Ultra. Hasta realizarla, no se puede afirmar que todos los permisos, roles, restricciones de batería, capturas, gestos y reconexiones se comporten igual que en el entorno de pruebas.</w:t>
+          <w:sz w:val="30"/>
+        </w:rPr>
+        <w:t>Las herramientas nativas devolvieron datos reales de ubicación, sensores, notificaciones, contactos, calendarios, archivos y galería. Android Use abrió Chrome y completó un flujo con captura, árbol, toque, pulsación larga, desplazamiento, texto, ENTER, navegación y parada. La notificación y el aura desaparecieron al finalizar. La cámara y el panel Wi-Fi se abrieron, pero no se tomó ninguna foto ni se cambió de red. Tampoco se realizaron llamadas ni se enviaron SMS.</w:t>
       </w:r>
     </w:p>
     <w:p>
@@ -16084,21 +16030,18 @@
     </w:p>
     <w:p>
       <w:pPr>
+        <w:pStyle w:val="Normal"/>
         <w:spacing w:after="240" w:before="240" w:line="276" w:lineRule="auto"/>
         <w:rPr/>
       </w:pPr>
       <w:r>
         <w:rPr>
-          <w:rFonts w:ascii="Arial" w:cs="Arial" w:eastAsia="Arial" w:hAnsi="Arial"/>
+          <w:rFonts w:ascii="Arial" w:hAnsi="Arial"/>
           <w:b w:val="0"/>
-          <w:bCs w:val="0"/>
           <w:i w:val="0"/>
-          <w:iCs w:val="0"/>
-          <w:sz w:val="30"/>
-          <w:szCs w:val="30"/>
-          <w:rtl w:val="0"/>
-        </w:rPr>
-        <w:t>El proyecto aún no está acabado, pero ya ha superado la fase de concepto. Existe una arquitectura funcional, un sistema operativo reproducible, una interfaz de voz medible, un dispositivo físico y una aplicación Android conectada mediante un Companion propio. El control móvil añade herramientas nativas y una ruta visual observable, aunque su validación física completa en el S23 Ultra continúa pendiente.</w:t>
+          <w:sz w:val="30"/>
+        </w:rPr>
+        <w:t>El proyecto aún no está acabado, pero ya ha superado la fase de concepto. Existe una arquitectura funcional, un sistema operativo reproducible, una interfaz de voz medible, un dispositivo físico y una aplicación Android conectada mediante un Companion propio. En el S23 Ultra se han validado las herramientas nativas no intrusivas y una ruta visual observable y cancelable. Las pruebas pendientes se concentran en BLE, biometría y acciones de telefonía o mensajería que no era apropiado ejecutar durante esta revisión.</w:t>
       </w:r>
     </w:p>
     <w:p>
@@ -16129,26 +16072,18 @@
     </w:p>
     <w:p>
       <w:pPr>
+        <w:pStyle w:val="Normal"/>
         <w:spacing w:after="240" w:before="240" w:line="276" w:lineRule="auto"/>
         <w:rPr/>
       </w:pPr>
       <w:r>
         <w:rPr>
-          <w:rFonts w:ascii="Arial" w:cs="Arial" w:eastAsia="Arial" w:hAnsi="Arial"/>
+          <w:rFonts w:ascii="Arial" w:hAnsi="Arial"/>
           <w:b w:val="0"/>
-          <w:bCs w:val="0"/>
           <w:i w:val="0"/>
-          <w:iCs w:val="0"/>
-          <w:sz w:val="30"/>
-          <w:szCs w:val="30"/>
-          <w:rtl w:val="0"/>
-        </w:rPr>
-        <w:t xml:space="preserve">La siguiente etapa será convertir el prototipo de depuración en una experiencia de producto. WebScreen dejará de mostrar tantos logs y timestamps y adoptará una interfaz minimalista para la pantalla de siete pulgadas. Los datos de diagnóstico seguirán guardándose, pero no ocuparán el centro de la conversación.</w:t>
-      </w:r>
-      <w:r>
-        <w:rPr>
-          <w:rtl w:val="0"/>
-        </w:rPr>
+          <w:sz w:val="30"/>
+        </w:rPr>
+        <w:t>WebScreen ya combina una vista de depuración con otra minimalista para la pantalla de siete pulgadas. Ambas reutilizan la misma conversación y las mismas herramientas; la interfaz final conserva la cara animada de ATLAS, mientras los logs y las métricas quedan disponibles en la vista técnica. El trabajo posterior debe medir su estabilidad durante sesiones largas y pulir las animaciones sin añadir información innecesaria a la pantalla principal.</w:t>
       </w:r>
     </w:p>
     <w:p>
@@ -16453,40 +16388,34 @@
     </w:p>
     <w:p>
       <w:pPr>
+        <w:pStyle w:val="Normal"/>
         <w:spacing w:after="240" w:before="240" w:line="276" w:lineRule="auto"/>
         <w:rPr/>
       </w:pPr>
       <w:r>
         <w:rPr>
-          <w:rFonts w:ascii="Arial" w:cs="Arial" w:eastAsia="Arial" w:hAnsi="Arial"/>
+          <w:rFonts w:ascii="Arial" w:hAnsi="Arial"/>
           <w:b w:val="0"/>
-          <w:bCs w:val="0"/>
           <w:i w:val="0"/>
-          <w:iCs w:val="0"/>
-          <w:sz w:val="30"/>
-          <w:szCs w:val="30"/>
-          <w:rtl w:val="0"/>
-        </w:rPr>
-        <w:t>Validar en el S23 Ultra el emparejamiento, la renovación de Realtime, la terminal persistente, los permisos y la recuperación tras restricciones de batería o memoria.</w:t>
-      </w:r>
-    </w:p>
-    <w:p>
-      <w:pPr>
+          <w:sz w:val="30"/>
+        </w:rPr>
+        <w:t>Ampliar la validación física en el S23 Ultra con BLE, biometría, llamadas y SMS únicamente cuando se disponga de condiciones seguras y confirmación explícita.</w:t>
+      </w:r>
+    </w:p>
+    <w:p>
+      <w:pPr>
+        <w:pStyle w:val="Normal"/>
         <w:spacing w:after="240" w:before="240" w:line="276" w:lineRule="auto"/>
         <w:rPr/>
       </w:pPr>
       <w:r>
         <w:rPr>
-          <w:rFonts w:ascii="Arial" w:cs="Arial" w:eastAsia="Arial" w:hAnsi="Arial"/>
+          <w:rFonts w:ascii="Arial" w:hAnsi="Arial"/>
           <w:b w:val="0"/>
-          <w:bCs w:val="0"/>
           <w:i w:val="0"/>
-          <w:iCs w:val="0"/>
-          <w:sz w:val="30"/>
-          <w:szCs w:val="30"/>
-          <w:rtl w:val="0"/>
-        </w:rPr>
-        <w:t>Medir el bucle de control visual con tareas reproducibles, registrar cada acción sin conservar capturas privadas y comprobar que el botón de parada interrumpe cualquier secuencia.</w:t>
+          <w:sz w:val="30"/>
+        </w:rPr>
+        <w:t>Repetir el bucle de control visual con tareas reproducibles en varias aplicaciones, medir cada paso y verificar que la parada interrumpe cualquier secuencia sin conservar capturas privadas.</w:t>
       </w:r>
     </w:p>
     <w:p>
@@ -17868,6 +17797,7 @@
     </w:p>
     <w:p>
       <w:pPr>
+        <w:pStyle w:val="Normal"/>
         <w:numPr>
           <w:ilvl w:val="0"/>
           <w:numId w:val="2"/>
@@ -17878,12 +17808,12 @@
       </w:pPr>
       <w:r>
         <w:rPr>
-          <w:rFonts w:ascii="Arial" w:cs="Arial" w:eastAsia="Arial" w:hAnsi="Arial"/>
-          <w:sz w:val="30"/>
-          <w:szCs w:val="30"/>
-          <w:rtl w:val="0"/>
-        </w:rPr>
-        <w:t>ATLAS Companion 0.2.0 para emparejamiento, estado, acciones Android y terminal PTY persistente.</w:t>
+          <w:rFonts w:ascii="Arial" w:hAnsi="Arial"/>
+          <w:b w:val="0"/>
+          <w:i w:val="0"/>
+          <w:sz w:val="30"/>
+        </w:rPr>
+        <w:t>ATLAS Companion 0.2.1 para emparejamiento, estado, acciones Android y terminal PTY persistente.</w:t>
       </w:r>
     </w:p>
     <w:p>

</xml_diff>

<commit_message>
docs: record Android reliability verification
</commit_message>
<xml_diff>
--- a/docs/atlas-teorico-codex.docx
+++ b/docs/atlas-teorico-codex.docx
@@ -5297,7 +5297,7 @@
           <w:i w:val="0"/>
           <w:sz w:val="30"/>
         </w:rPr>
-        <w:t>La aplicación Android convierte el móvil en otro terminal de ATLAS. Su interfaz separa la conversación, las acciones configurables, la terminal, el estado del A1 y los ajustes. La ruta de voz prepara gpt-realtime-2.1 al mostrar la aplicación, antes de pulsar el micrófono. Al enviarla a segundo plano libera WebRTC para reducir el consumo y vuelve a prepararlo al regresar. El chat es de texto, muestra el mensaje del usuario de inmediato y recibe la respuesta progresivamente.</w:t>
+        <w:t xml:space="preserve">La versión Android 0.2.4-preview convierte el móvil en otro terminal de ATLAS. Su interfaz separa la conversación, las acciones configurables, la terminal, el estado del A1 y los ajustes. La ruta de voz prepara gpt-realtime-2.1 al mostrar la aplicación, antes de pulsar el micrófono. Al enviarla a segundo plano libera WebRTC para reducir el consumo y vuelve a prepararlo al regresar. El chat es de texto, muestra el mensaje del usuario de inmediato y recibe la respuesta progresivamente.</w:t>
       </w:r>
     </w:p>
     <w:p>
@@ -5369,7 +5369,7 @@
           <w:szCs w:val="30"/>
           <w:rtl w:val="0"/>
         </w:rPr>
-        <w:t>La ruta principal de conexión utiliza una red privada Tailscale compartida por razer, atlas-a1 y s23u. Tailscale cifra el tráfico con WireGuard y trata de establecer una conexión directa entre pares; cuando la topología de red no lo permite, puede recurrir a un relay DERP. Por tanto, la arquitectura evita publicar el Companion en Internet, pero no presupone que todos los enlaces serán físicamente directos.</w:t>
+        <w:t xml:space="preserve">La ruta principal de conexión utiliza una red privada Tailscale compartida por razer, atlas-a1 y s23u. Cuando el teléfono y A1 comparten una LAN, Tailscale prioriza una ruta UDP directa entre pares para reducir la latencia. Si la topología no permite el enlace directo, mantiene el mismo transporte cifrado mediante un relay DERP. Ambas rutas permanecen dentro de la tailnet y evitan publicar el Companion en Internet; tailscale status y tailscale ping permiten distinguir la ruta realmente utilizada.</w:t>
       </w:r>
     </w:p>
     <w:p>
@@ -5385,7 +5385,7 @@
           <w:i w:val="0"/>
           <w:sz w:val="30"/>
         </w:rPr>
-        <w:t>La aplicación resuelve atlas-a1 mediante MagicDNS y abre wss://atlas-a1:5010/app. Si el WebSocket no está disponible, utiliza una petición HTTPS cifrada al mismo Companion como ruta de recuperación. Cloudflare queda fuera del recorrido principal y no se activa automáticamente ante un fallo de Tailscale; solo puede elegirse como compatibilidad explícita. El protocolo de aplicación protege además cada mensaje con AES-GCM, de modo que pertenecer a la red Tailscale no sustituye el emparejamiento propio de ATLAS.</w:t>
+        <w:t xml:space="preserve">Los emparejamientos actuales guardan wss://&lt;IPv4 Tailscale 100.x&gt;:5010/app. Esa dirección es privada de la tailnet, no una dirección de la LAN. MagicDNS queda solo para la migración de emparejamientos v1 o para equipos sin IPv4 Tailscale y tampoco sale de la tailnet. Cloudflare no se activa automáticamente como recuperación. TLS fijado y AES-GCM protegen además el transporte y cada mensaje, de modo que pertenecer a Tailscale no sustituye el emparejamiento propio de ATLAS.</w:t>
       </w:r>
     </w:p>
     <w:p>
@@ -5444,7 +5444,7 @@
           <w:szCs w:val="30"/>
           <w:rtl w:val="0"/>
         </w:rPr>
-        <w:t>ATLAS prioriza las interfaces nativas de Android. atlas-app control reúne operaciones estructuradas para consultar o modificar, según los permisos concedidos, llamadas, SMS, contactos, calendario, notificaciones, ubicación y archivos. Una llamada del sistema no se presenta como control visual del teléfono. Algunas operaciones exigen una confirmación, una aplicación predeterminada o un rol especial de Android, y ningún permiso se concede automáticamente.</w:t>
+        <w:t xml:space="preserve">ATLAS prioriza las interfaces nativas de Android. atlas-app control reúne operaciones estructuradas para consultar o modificar, según los permisos concedidos, llamadas, SMS, contactos, calendario, notificaciones, ubicación y archivos. location.get devuelve formattedAddress completo y campos address estructurados cuando Android puede geocodificar; si no puede, conserva las coordenadas y el error sin inventar una dirección. Al informar al propietario, ATLAS reproduce esa dirección exacta y no la reduce a una ciudad. Algunas operaciones exigen confirmación, una aplicación predeterminada o un rol especial, y ningún permiso se concede automáticamente.</w:t>
       </w:r>
     </w:p>
     <w:p>
@@ -5460,7 +5460,7 @@
           <w:i w:val="0"/>
           <w:sz w:val="30"/>
         </w:rPr>
-        <w:t>La automatización visual se reserva para tareas que no ofrecen una API adecuada, como abrir una web y completar una búsqueda. atlas-androiduse ofrece acciones pequeñas y observables: start, status, screenshot, tree, tap, long-press, swipe, text, key, launch, wait y stop. Los gestos utilizan coordenadas normalizadas entre 0 y 1 y el árbol oculta los campos de contraseña y sus descendientes. En Android 13 o superior, las aplicaciones se abren mediante IntentSender para no confundir las restricciones de visibilidad de paquetes con una ausencia real. Cada captura se incorpora a gpt-realtime-2.1 como una entrada de imagen y el modelo vuelve a observar después de actuar.</w:t>
+        <w:t xml:space="preserve">La automatización visual se reserva para tareas sin una API adecuada. atlas-androiduse ofrece start, status, screenshot, tree, click, tap, long-press, swipe, text, key, launch, wait y stop. androiduse.click busca primero el texto visible o la descripción accesible indicada y pulsa el nodo coincidente o su ancestro clicable; las coordenadas normalizadas quedan como fallback cuando no existe una etiqueta accesible. start no solicita una captura inicial, mientras que las acciones visuales posteriores vuelven a inspeccionar el estado.</w:t>
       </w:r>
     </w:p>
     <w:p>
@@ -5476,7 +5476,7 @@
           <w:i w:val="0"/>
           <w:sz w:val="30"/>
         </w:rPr>
-        <w:t>Mientras la automatización visual está activa, Android muestra una notificación transitoria, un resplandor azul en los bordes y un botón rojo para detenerla. La capa bloquea el tacto del usuario, pero se vuelve invisible durante 80 milisegundos antes de cada gesto inyectado en One UI para no interceptarlo; al terminar recupera el bloqueo. Al finalizar o cancelar la tarea desaparecen la capa y la notificación. El servicio de accesibilidad se habilita manualmente en los ajustes del teléfono y el usuario puede retirarlo en cualquier momento.</w:t>
+        <w:t xml:space="preserve">Las capturas se reducen a un máximo de 640 píxeles de ancho y se codifican como JPEG con calidad 82 antes de enviarse. El backend conserva internamente mime e imageBase64 para interpretar el formato real, acepta PNG antiguos y elimina el base64 del resultado visible para el modelo. La reducción no cambia las coordenadas físicas utilizadas por los gestos.</w:t>
       </w:r>
     </w:p>
     <w:p>
@@ -5492,7 +5492,23 @@
           <w:i w:val="0"/>
           <w:sz w:val="30"/>
         </w:rPr>
-        <w:t>El teléfono devuelve un error explícito cuando no está conectado o no posee el permiso necesario. Las capturas pueden contener mensajes, nombres o datos privados, por lo que se mantienen dentro del turno y no se incorporan a logs generales. En el S23 Ultra se comprobaron la conexión Tailscale, las herramientas nativas no intrusivas, Realtime, voz por pulsación, chat, capturas, árbol de accesibilidad, gestos, introducción de texto, navegación y parada. No se realizaron llamadas ni SMS, no se tomó ninguna foto y no se cambió la red Wi-Fi.</w:t>
+        <w:t>Mientras la automatización visual está activa, Android muestra una notificación transitoria, un resplandor azul en los bordes y un botón rojo para detenerla. La capa bloquea el tacto del usuario, pero se vuelve invisible durante 80 milisegundos antes de cada gesto inyectado en One UI para no interceptarlo; al terminar recupera el bloqueo. Al finalizar o cancelar la tarea desaparecen la capa y la notificación. El servicio de accesibilidad se habilita manualmente en los ajustes del teléfono y el usuario puede retirarlo en cualquier momento.</w:t>
+      </w:r>
+    </w:p>
+    <w:p>
+      <w:pPr>
+        <w:pStyle w:val="Normal"/>
+        <w:spacing w:after="240" w:before="240" w:line="276" w:lineRule="auto"/>
+        <w:rPr/>
+      </w:pPr>
+      <w:r>
+        <w:rPr>
+          <w:rFonts w:ascii="Arial" w:hAnsi="Arial"/>
+          <w:b w:val="0"/>
+          <w:i w:val="0"/>
+          <w:sz w:val="30"/>
+        </w:rPr>
+        <w:t xml:space="preserve">Un error recuperable de click, gesto, captura o inspección conserva la sesión Android Use activa para poder corregir el siguiente paso. Solo la pérdida terminal del socket, el dispositivo o el servicio de Accesibilidad, además de la cancelación, el watchdog, la salida del cliente o el final de la tarea, obliga a detenerla. Las capturas pueden contener mensajes, nombres o datos privados, por lo que permanecen dentro del turno y no se incorporan a los logs generales.</w:t>
       </w:r>
     </w:p>
     <w:p>
@@ -6740,7 +6756,7 @@
           <w:szCs w:val="30"/>
           <w:rtl w:val="0"/>
         </w:rPr>
-        <w:t xml:space="preserve">La interfaz de depuración incluyó un selector entre el TTS del navegador y ElevenLabs, además de una pestaña independiente para probar texto a voz y medir cuánto tardaba. Esta separación fue útil porque permitió saber si un problema procedía del agente o únicamente de la voz. Durante el desarrollo incluso hubo momentos en los que la voz del navegador cambió de calidad de manera temporal, recordándome que una dependencia externa puede variar sin que haya cambiado mi código.</w:t>
+        <w:t xml:space="preserve">La interfaz de depuración incluye un selector entre el TTS del navegador y ElevenLabs, además de una pestaña independiente para medir la voz. La ruta externa utiliza por defecto eleven_flash_v2_5 y el proxy reenvía cada fragmento HTTP disponible tan pronto como llega, sin esperar a completar un bloque de 8 KiB. El hito playing se registra cuando Chrome comienza la reproducción; la latencia anterior del proveedor, la red, la decodificación y el búfer sigue formando parte de la espera percibida.</w:t>
       </w:r>
       <w:r>
         <w:rPr>
@@ -8450,7 +8466,7 @@
           <w:szCs w:val="30"/>
           <w:rtl w:val="0"/>
         </w:rPr>
-        <w:t xml:space="preserve">Las consultas de fecha, RAM, almacenamiento, red y servicios pueden resolverse con atlas_shell. Las búsquedas utilizan atlas_web_search. Los comandos atlas-* reúnen tareas habituales y atlas-routines permite gestionarlas por SSH. Cuando una frase exacta ya tiene una rutina, WebScreen y atlas-chat la resuelven localmente antes de crear una respuesta de Realtime.</w:t>
+        <w:t xml:space="preserve">Las consultas de fecha, RAM, almacenamiento, red y servicios pueden resolverse con atlas_shell. Las búsquedas utilizan atlas_web_search y atlas-routines gestiona automatizaciones. Cuando coincide una frase exacta, la rutina se ejecuta una sola vez. Si termina correctamente y devuelve requiresModel: false, WebScreen o atlas-chat entrega, si existe, únicamente el SAY resuelto sin abrir una respuesta Realtime. Con requiresModel: true, o si la ejecución falla, entrega al modelo el executionId para consultar el resultado ya registrado mediante last_result, sin repetir los pasos.</w:t>
       </w:r>
       <w:r>
         <w:rPr>
@@ -8548,7 +8564,7 @@
           <w:szCs w:val="30"/>
           <w:rtl w:val="0"/>
         </w:rPr>
-        <w:t xml:space="preserve">Las rutinas sirven para tareas recurrentes con poco margen de variación, como consultar la hora o controlar un dispositivo ya identificado. La petición se normaliza y se compara con una frase de activación exacta antes de solicitar una respuesta al modelo. Si coincide, los pasos se ejecutan en la Raspberry Pi. Así se reducen latencia y consumo de tokens y se conserva una respuesta conocida.</w:t>
+        <w:t xml:space="preserve">Las rutinas sirven para tareas recurrentes con poco margen de variación. La petición se normaliza y se compara con activaciones exactas. requires_model separa los éxitos completamente deterministas de los que necesitan una interpretación posterior: con false, una ejecución correcta evita el modelo; con true, Realtime continúa a partir de la ejecución ya completada. Los fallos se remiten igualmente al modelo con su executionId, sin repetir la rutina.</w:t>
       </w:r>
     </w:p>
     <w:p>
@@ -8567,7 +8583,7 @@
           <w:szCs w:val="30"/>
           <w:rtl w:val="0"/>
         </w:rPr>
-        <w:t xml:space="preserve">El registro está en /home/atlas/.atlas/routines/ROUTINES.md: un documento legible con un bloque JSON validado y escrito de forma atómica. Cada definición guarda nombre, descripción, razonamiento de diseño, frases exactas, estado y pasos ordenados. Un paso shell puede capturar una salida en una variable; un paso SAY forma la respuesta oral. Si no existe SAY, el éxito es intencionadamente silencioso.</w:t>
+        <w:t xml:space="preserve">El registro está en /home/atlas/.atlas/routines/ROUTINES.md: un documento legible con un bloque JSON validado y escrito de forma atómica. Cada definición guarda nombre, descripción, triggers como cadenas canónicas, estado, requires_model y pasos ordenados; las representaciones legacy de triggers se normalizan al leerlas. Un paso shell puede capturar una variable y SAY forma la respuesta. Una variable SAY sin resolver produce un fallo y nunca se pronuncia; sin SAY, el éxito es intencionadamente silencioso.</w:t>
       </w:r>
     </w:p>
     <w:p>
@@ -8586,7 +8602,7 @@
           <w:szCs w:val="30"/>
           <w:rtl w:val="0"/>
         </w:rPr>
-        <w:t xml:space="preserve">Las rutinas se pueden crear hablando con ATLAS o mediante atlas-routines por SSH. Durante la conversación, el sistema pregunta qué debe hacer, cuál será la frase exacta y qué nombre tendrá. Una acción dependiente del entorno puede probarse antes de guardarse para conservar el comando directo más corto que se haya verificado. Si un paso falla, la secuencia se detiene y registra el resultado. Realtime puede explicarlo o corregir una definición sencilla, pero no repite automáticamente una operación que quizá ya haya producido efectos.</w:t>
+        <w:t xml:space="preserve">Las rutinas se pueden crear hablando con ATLAS o mediante atlas-routines por SSH. list muestra solo líneas como 1. hora · activa; list --expand añade ID, descripción, frases, Modelo: sí/no y pasos. Las creaciones nuevas incluyen requires_model y la CLI permite elegirlo con --requires-model o --no-requires-model. Si un paso falla, la secuencia se detiene y registra el resultado; ninguna recuperación repite automáticamente una operación que quizá ya haya producido efectos.</w:t>
       </w:r>
     </w:p>
     <w:p>
@@ -14108,6 +14124,22 @@
     </w:p>
     <w:p>
       <w:pPr>
+        <w:pStyle w:val="Normal"/>
+        <w:spacing w:after="240" w:before="240" w:line="276" w:lineRule="auto"/>
+        <w:rPr/>
+      </w:pPr>
+      <w:r>
+        <w:rPr>
+          <w:rFonts w:ascii="Arial" w:hAnsi="Arial"/>
+          <w:b w:val="0"/>
+          <w:i w:val="0"/>
+          <w:sz w:val="30"/>
+        </w:rPr>
+        <w:t xml:space="preserve">En la tanda de cierre iniciada el 8 y finalizada el 9 de septiembre de 2026 se registraron 598 comprobaciones automatizadas, además de lint y build Android. Para Android 0.2.4, la comprobación física y de capturas registró un inicio de Android Use en 192,2 ms; una captura JPEG válida en 471,0 ms, reducida de 1080 × 2316 a 640 × 1372 y 41.299 bytes; y, tras un clic semántico sobre una etiqueta deliberadamente inexistente que devolvió el HTTP 502 esperado en 183,3 ms, la sesión aún enabled=true y controlling=true, otra captura JPEG de 640 × 1372 y 41.175 bytes en 337,6 ms y el árbol filtrado en 165,0 ms. Para las rutinas, la comprobación registró 8,4–10,9 ms en el motor, 53,9 ms mediante HTTP y, en atlas-chat, 0,01 s hasta la salida visible y 592,5 ms para el proceso completo. El cierre distingue los contratos automatizados de la evidencia en dispositivo. Tailscale confirmó una ruta UDP directa. En una solicitud real corta, ElevenLabs entregó el primer byte de audio en 1,201 s y completó el flujo HTTP en 1,212 s; esta medida no se confunde con el evento posterior playing del navegador.</w:t>
+      </w:r>
+    </w:p>
+    <w:p>
+      <w:pPr>
         <w:spacing w:after="240" w:before="240" w:line="276" w:lineRule="auto"/>
         <w:rPr/>
       </w:pPr>
@@ -17437,7 +17469,7 @@
           <w:szCs w:val="30"/>
           <w:rtl w:val="0"/>
         </w:rPr>
-        <w:t xml:space="preserve">ElevenLabs para las pruebas de síntesis de voz externa.</w:t>
+        <w:t xml:space="preserve">ElevenLabs Flash v2.5 para síntesis de voz externa en streaming de baja latencia.</w:t>
       </w:r>
       <w:r>
         <w:rPr>
@@ -17752,7 +17784,7 @@
           <w:szCs w:val="30"/>
           <w:rtl w:val="0"/>
         </w:rPr>
-        <w:t>Android SDK, Java, WebView y AccessibilityService para la aplicación móvil, sus permisos y la automatización visual autorizada.</w:t>
+        <w:t xml:space="preserve">ATLAS Android 0.2.4-preview, Android SDK, Java, WebView y AccessibilityService para la aplicación móvil, sus permisos y la automatización visual autorizada.</w:t>
       </w:r>
     </w:p>
     <w:p>
@@ -17772,7 +17804,7 @@
           <w:szCs w:val="30"/>
           <w:rtl w:val="0"/>
         </w:rPr>
-        <w:t>Tailscale, WireGuard, MagicDNS y DERP para la red privada entre razer, atlas-a1 y s23u.</w:t>
+        <w:t xml:space="preserve">Tailscale IPv4 privada, WireGuard, MagicDNS de compatibilidad y DERP cifrado para la red privada entre razer, atlas-a1 y s23u.</w:t>
       </w:r>
     </w:p>
     <w:p>

</xml_diff>